<commit_message>
Fill in Insertion Sort and Selection Sort experimental data tables
</commit_message>
<xml_diff>
--- a/theoretical_vs_experimental_data.docx
+++ b/theoretical_vs_experimental_data.docx
@@ -946,66 +946,69 @@
               <w:rPr>
                 <w:rtl w:val="0"/>
               </w:rPr>
-            </w:r>
-          </w:p>
-        </w:tc>
-        <w:tc>
-          <w:tcPr>
-            <w:tcBorders>
-              <w:top w:color="cccccc" w:space="0" w:sz="4" w:val="single"/>
-              <w:left w:color="cccccc" w:space="0" w:sz="4" w:val="single"/>
-              <w:bottom w:color="cccccc" w:space="0" w:sz="4" w:val="single"/>
-              <w:right w:color="cccccc" w:space="0" w:sz="4" w:val="single"/>
-            </w:tcBorders>
-            <w:shd w:fill="f5f5f5" w:val="clear"/>
-            <w:tcMar>
-              <w:top w:w="60.0" w:type="dxa"/>
-              <w:left w:w="100.0" w:type="dxa"/>
-              <w:bottom w:w="60.0" w:type="dxa"/>
-              <w:right w:w="100.0" w:type="dxa"/>
-            </w:tcMar>
-            <w:vAlign w:val="center"/>
-          </w:tcPr>
-          <w:p>
-            <w:pPr>
-              <w:spacing w:after="0" w:before="0" w:lineRule="auto"/>
-              <w:jc w:val="center"/>
-              <w:rPr/>
-            </w:pPr>
-            <w:r>
-              <w:rPr>
-                <w:rtl w:val="0"/>
-              </w:rPr>
-            </w:r>
-          </w:p>
-        </w:tc>
-        <w:tc>
-          <w:tcPr>
-            <w:tcBorders>
-              <w:top w:color="cccccc" w:space="0" w:sz="4" w:val="single"/>
-              <w:left w:color="cccccc" w:space="0" w:sz="4" w:val="single"/>
-              <w:bottom w:color="cccccc" w:space="0" w:sz="4" w:val="single"/>
-              <w:right w:color="cccccc" w:space="0" w:sz="4" w:val="single"/>
-            </w:tcBorders>
-            <w:shd w:fill="f5f5f5" w:val="clear"/>
-            <w:tcMar>
-              <w:top w:w="60.0" w:type="dxa"/>
-              <w:left w:w="100.0" w:type="dxa"/>
-              <w:bottom w:w="60.0" w:type="dxa"/>
-              <w:right w:w="100.0" w:type="dxa"/>
-            </w:tcMar>
-            <w:vAlign w:val="center"/>
-          </w:tcPr>
-          <w:p>
-            <w:pPr>
-              <w:spacing w:after="0" w:before="0" w:lineRule="auto"/>
-              <w:jc w:val="center"/>
-              <w:rPr/>
-            </w:pPr>
-            <w:r>
-              <w:rPr>
-                <w:rtl w:val="0"/>
-              </w:rPr>
+              <w:t>1,667</w:t>
+            </w:r>
+          </w:p>
+        </w:tc>
+        <w:tc>
+          <w:tcPr>
+            <w:tcBorders>
+              <w:top w:color="cccccc" w:space="0" w:sz="4" w:val="single"/>
+              <w:left w:color="cccccc" w:space="0" w:sz="4" w:val="single"/>
+              <w:bottom w:color="cccccc" w:space="0" w:sz="4" w:val="single"/>
+              <w:right w:color="cccccc" w:space="0" w:sz="4" w:val="single"/>
+            </w:tcBorders>
+            <w:shd w:fill="f5f5f5" w:val="clear"/>
+            <w:tcMar>
+              <w:top w:w="60.0" w:type="dxa"/>
+              <w:left w:w="100.0" w:type="dxa"/>
+              <w:bottom w:w="60.0" w:type="dxa"/>
+              <w:right w:w="100.0" w:type="dxa"/>
+            </w:tcMar>
+            <w:vAlign w:val="center"/>
+          </w:tcPr>
+          <w:p>
+            <w:pPr>
+              <w:spacing w:after="0" w:before="0" w:lineRule="auto"/>
+              <w:jc w:val="center"/>
+              <w:rPr/>
+            </w:pPr>
+            <w:r>
+              <w:rPr>
+                <w:rtl w:val="0"/>
+              </w:rPr>
+              <w:t>999</w:t>
+            </w:r>
+          </w:p>
+        </w:tc>
+        <w:tc>
+          <w:tcPr>
+            <w:tcBorders>
+              <w:top w:color="cccccc" w:space="0" w:sz="4" w:val="single"/>
+              <w:left w:color="cccccc" w:space="0" w:sz="4" w:val="single"/>
+              <w:bottom w:color="cccccc" w:space="0" w:sz="4" w:val="single"/>
+              <w:right w:color="cccccc" w:space="0" w:sz="4" w:val="single"/>
+            </w:tcBorders>
+            <w:shd w:fill="f5f5f5" w:val="clear"/>
+            <w:tcMar>
+              <w:top w:w="60.0" w:type="dxa"/>
+              <w:left w:w="100.0" w:type="dxa"/>
+              <w:bottom w:w="60.0" w:type="dxa"/>
+              <w:right w:w="100.0" w:type="dxa"/>
+            </w:tcMar>
+            <w:vAlign w:val="center"/>
+          </w:tcPr>
+          <w:p>
+            <w:pPr>
+              <w:spacing w:after="0" w:before="0" w:lineRule="auto"/>
+              <w:jc w:val="center"/>
+              <w:rPr/>
+            </w:pPr>
+            <w:r>
+              <w:rPr>
+                <w:rtl w:val="0"/>
+              </w:rPr>
+              <w:t>1.6670</w:t>
             </w:r>
           </w:p>
         </w:tc>
@@ -1152,6 +1155,7 @@
               <w:rPr>
                 <w:rtl w:val="0"/>
               </w:rPr>
+              <w:t>8,042</w:t>
             </w:r>
           </w:p>
         </w:tc>
@@ -1182,6 +1186,7 @@
               <w:rPr>
                 <w:rtl w:val="0"/>
               </w:rPr>
+              <w:t>4,999</w:t>
             </w:r>
           </w:p>
         </w:tc>
@@ -1212,6 +1217,7 @@
               <w:rPr>
                 <w:rtl w:val="0"/>
               </w:rPr>
+              <w:t>1.6084</w:t>
             </w:r>
           </w:p>
         </w:tc>
@@ -1358,66 +1364,69 @@
               <w:rPr>
                 <w:rtl w:val="0"/>
               </w:rPr>
-            </w:r>
-          </w:p>
-        </w:tc>
-        <w:tc>
-          <w:tcPr>
-            <w:tcBorders>
-              <w:top w:color="cccccc" w:space="0" w:sz="4" w:val="single"/>
-              <w:left w:color="cccccc" w:space="0" w:sz="4" w:val="single"/>
-              <w:bottom w:color="cccccc" w:space="0" w:sz="4" w:val="single"/>
-              <w:right w:color="cccccc" w:space="0" w:sz="4" w:val="single"/>
-            </w:tcBorders>
-            <w:shd w:fill="f5f5f5" w:val="clear"/>
-            <w:tcMar>
-              <w:top w:w="60.0" w:type="dxa"/>
-              <w:left w:w="100.0" w:type="dxa"/>
-              <w:bottom w:w="60.0" w:type="dxa"/>
-              <w:right w:w="100.0" w:type="dxa"/>
-            </w:tcMar>
-            <w:vAlign w:val="center"/>
-          </w:tcPr>
-          <w:p>
-            <w:pPr>
-              <w:spacing w:after="0" w:before="0" w:lineRule="auto"/>
-              <w:jc w:val="center"/>
-              <w:rPr/>
-            </w:pPr>
-            <w:r>
-              <w:rPr>
-                <w:rtl w:val="0"/>
-              </w:rPr>
-            </w:r>
-          </w:p>
-        </w:tc>
-        <w:tc>
-          <w:tcPr>
-            <w:tcBorders>
-              <w:top w:color="cccccc" w:space="0" w:sz="4" w:val="single"/>
-              <w:left w:color="cccccc" w:space="0" w:sz="4" w:val="single"/>
-              <w:bottom w:color="cccccc" w:space="0" w:sz="4" w:val="single"/>
-              <w:right w:color="cccccc" w:space="0" w:sz="4" w:val="single"/>
-            </w:tcBorders>
-            <w:shd w:fill="f5f5f5" w:val="clear"/>
-            <w:tcMar>
-              <w:top w:w="60.0" w:type="dxa"/>
-              <w:left w:w="100.0" w:type="dxa"/>
-              <w:bottom w:w="60.0" w:type="dxa"/>
-              <w:right w:w="100.0" w:type="dxa"/>
-            </w:tcMar>
-            <w:vAlign w:val="center"/>
-          </w:tcPr>
-          <w:p>
-            <w:pPr>
-              <w:spacing w:after="0" w:before="0" w:lineRule="auto"/>
-              <w:jc w:val="center"/>
-              <w:rPr/>
-            </w:pPr>
-            <w:r>
-              <w:rPr>
-                <w:rtl w:val="0"/>
-              </w:rPr>
+              <w:t>16,042</w:t>
+            </w:r>
+          </w:p>
+        </w:tc>
+        <w:tc>
+          <w:tcPr>
+            <w:tcBorders>
+              <w:top w:color="cccccc" w:space="0" w:sz="4" w:val="single"/>
+              <w:left w:color="cccccc" w:space="0" w:sz="4" w:val="single"/>
+              <w:bottom w:color="cccccc" w:space="0" w:sz="4" w:val="single"/>
+              <w:right w:color="cccccc" w:space="0" w:sz="4" w:val="single"/>
+            </w:tcBorders>
+            <w:shd w:fill="f5f5f5" w:val="clear"/>
+            <w:tcMar>
+              <w:top w:w="60.0" w:type="dxa"/>
+              <w:left w:w="100.0" w:type="dxa"/>
+              <w:bottom w:w="60.0" w:type="dxa"/>
+              <w:right w:w="100.0" w:type="dxa"/>
+            </w:tcMar>
+            <w:vAlign w:val="center"/>
+          </w:tcPr>
+          <w:p>
+            <w:pPr>
+              <w:spacing w:after="0" w:before="0" w:lineRule="auto"/>
+              <w:jc w:val="center"/>
+              <w:rPr/>
+            </w:pPr>
+            <w:r>
+              <w:rPr>
+                <w:rtl w:val="0"/>
+              </w:rPr>
+              <w:t>9,999</w:t>
+            </w:r>
+          </w:p>
+        </w:tc>
+        <w:tc>
+          <w:tcPr>
+            <w:tcBorders>
+              <w:top w:color="cccccc" w:space="0" w:sz="4" w:val="single"/>
+              <w:left w:color="cccccc" w:space="0" w:sz="4" w:val="single"/>
+              <w:bottom w:color="cccccc" w:space="0" w:sz="4" w:val="single"/>
+              <w:right w:color="cccccc" w:space="0" w:sz="4" w:val="single"/>
+            </w:tcBorders>
+            <w:shd w:fill="f5f5f5" w:val="clear"/>
+            <w:tcMar>
+              <w:top w:w="60.0" w:type="dxa"/>
+              <w:left w:w="100.0" w:type="dxa"/>
+              <w:bottom w:w="60.0" w:type="dxa"/>
+              <w:right w:w="100.0" w:type="dxa"/>
+            </w:tcMar>
+            <w:vAlign w:val="center"/>
+          </w:tcPr>
+          <w:p>
+            <w:pPr>
+              <w:spacing w:after="0" w:before="0" w:lineRule="auto"/>
+              <w:jc w:val="center"/>
+              <w:rPr/>
+            </w:pPr>
+            <w:r>
+              <w:rPr>
+                <w:rtl w:val="0"/>
+              </w:rPr>
+              <w:t>1.6042</w:t>
             </w:r>
           </w:p>
         </w:tc>
@@ -1564,6 +1573,7 @@
               <w:rPr>
                 <w:rtl w:val="0"/>
               </w:rPr>
+              <w:t>40,167</w:t>
             </w:r>
           </w:p>
         </w:tc>
@@ -1594,6 +1604,7 @@
               <w:rPr>
                 <w:rtl w:val="0"/>
               </w:rPr>
+              <w:t>24,999</w:t>
             </w:r>
           </w:p>
         </w:tc>
@@ -1624,6 +1635,7 @@
               <w:rPr>
                 <w:rtl w:val="0"/>
               </w:rPr>
+              <w:t>1.6067</w:t>
             </w:r>
           </w:p>
         </w:tc>
@@ -1770,66 +1782,69 @@
               <w:rPr>
                 <w:rtl w:val="0"/>
               </w:rPr>
-            </w:r>
-          </w:p>
-        </w:tc>
-        <w:tc>
-          <w:tcPr>
-            <w:tcBorders>
-              <w:top w:color="cccccc" w:space="0" w:sz="4" w:val="single"/>
-              <w:left w:color="cccccc" w:space="0" w:sz="4" w:val="single"/>
-              <w:bottom w:color="cccccc" w:space="0" w:sz="4" w:val="single"/>
-              <w:right w:color="cccccc" w:space="0" w:sz="4" w:val="single"/>
-            </w:tcBorders>
-            <w:shd w:fill="f5f5f5" w:val="clear"/>
-            <w:tcMar>
-              <w:top w:w="60.0" w:type="dxa"/>
-              <w:left w:w="100.0" w:type="dxa"/>
-              <w:bottom w:w="60.0" w:type="dxa"/>
-              <w:right w:w="100.0" w:type="dxa"/>
-            </w:tcMar>
-            <w:vAlign w:val="center"/>
-          </w:tcPr>
-          <w:p>
-            <w:pPr>
-              <w:spacing w:after="0" w:before="0" w:lineRule="auto"/>
-              <w:jc w:val="center"/>
-              <w:rPr/>
-            </w:pPr>
-            <w:r>
-              <w:rPr>
-                <w:rtl w:val="0"/>
-              </w:rPr>
-            </w:r>
-          </w:p>
-        </w:tc>
-        <w:tc>
-          <w:tcPr>
-            <w:tcBorders>
-              <w:top w:color="cccccc" w:space="0" w:sz="4" w:val="single"/>
-              <w:left w:color="cccccc" w:space="0" w:sz="4" w:val="single"/>
-              <w:bottom w:color="cccccc" w:space="0" w:sz="4" w:val="single"/>
-              <w:right w:color="cccccc" w:space="0" w:sz="4" w:val="single"/>
-            </w:tcBorders>
-            <w:shd w:fill="f5f5f5" w:val="clear"/>
-            <w:tcMar>
-              <w:top w:w="60.0" w:type="dxa"/>
-              <w:left w:w="100.0" w:type="dxa"/>
-              <w:bottom w:w="60.0" w:type="dxa"/>
-              <w:right w:w="100.0" w:type="dxa"/>
-            </w:tcMar>
-            <w:vAlign w:val="center"/>
-          </w:tcPr>
-          <w:p>
-            <w:pPr>
-              <w:spacing w:after="0" w:before="0" w:lineRule="auto"/>
-              <w:jc w:val="center"/>
-              <w:rPr/>
-            </w:pPr>
-            <w:r>
-              <w:rPr>
-                <w:rtl w:val="0"/>
-              </w:rPr>
+              <w:t>80,292</w:t>
+            </w:r>
+          </w:p>
+        </w:tc>
+        <w:tc>
+          <w:tcPr>
+            <w:tcBorders>
+              <w:top w:color="cccccc" w:space="0" w:sz="4" w:val="single"/>
+              <w:left w:color="cccccc" w:space="0" w:sz="4" w:val="single"/>
+              <w:bottom w:color="cccccc" w:space="0" w:sz="4" w:val="single"/>
+              <w:right w:color="cccccc" w:space="0" w:sz="4" w:val="single"/>
+            </w:tcBorders>
+            <w:shd w:fill="f5f5f5" w:val="clear"/>
+            <w:tcMar>
+              <w:top w:w="60.0" w:type="dxa"/>
+              <w:left w:w="100.0" w:type="dxa"/>
+              <w:bottom w:w="60.0" w:type="dxa"/>
+              <w:right w:w="100.0" w:type="dxa"/>
+            </w:tcMar>
+            <w:vAlign w:val="center"/>
+          </w:tcPr>
+          <w:p>
+            <w:pPr>
+              <w:spacing w:after="0" w:before="0" w:lineRule="auto"/>
+              <w:jc w:val="center"/>
+              <w:rPr/>
+            </w:pPr>
+            <w:r>
+              <w:rPr>
+                <w:rtl w:val="0"/>
+              </w:rPr>
+              <w:t>49,999</w:t>
+            </w:r>
+          </w:p>
+        </w:tc>
+        <w:tc>
+          <w:tcPr>
+            <w:tcBorders>
+              <w:top w:color="cccccc" w:space="0" w:sz="4" w:val="single"/>
+              <w:left w:color="cccccc" w:space="0" w:sz="4" w:val="single"/>
+              <w:bottom w:color="cccccc" w:space="0" w:sz="4" w:val="single"/>
+              <w:right w:color="cccccc" w:space="0" w:sz="4" w:val="single"/>
+            </w:tcBorders>
+            <w:shd w:fill="f5f5f5" w:val="clear"/>
+            <w:tcMar>
+              <w:top w:w="60.0" w:type="dxa"/>
+              <w:left w:w="100.0" w:type="dxa"/>
+              <w:bottom w:w="60.0" w:type="dxa"/>
+              <w:right w:w="100.0" w:type="dxa"/>
+            </w:tcMar>
+            <w:vAlign w:val="center"/>
+          </w:tcPr>
+          <w:p>
+            <w:pPr>
+              <w:spacing w:after="0" w:before="0" w:lineRule="auto"/>
+              <w:jc w:val="center"/>
+              <w:rPr/>
+            </w:pPr>
+            <w:r>
+              <w:rPr>
+                <w:rtl w:val="0"/>
+              </w:rPr>
+              <w:t>1.6058</w:t>
             </w:r>
           </w:p>
         </w:tc>
@@ -2407,66 +2422,69 @@
               <w:rPr>
                 <w:rtl w:val="0"/>
               </w:rPr>
-            </w:r>
-          </w:p>
-        </w:tc>
-        <w:tc>
-          <w:tcPr>
-            <w:tcBorders>
-              <w:top w:color="cccccc" w:space="0" w:sz="4" w:val="single"/>
-              <w:left w:color="cccccc" w:space="0" w:sz="4" w:val="single"/>
-              <w:bottom w:color="cccccc" w:space="0" w:sz="4" w:val="single"/>
-              <w:right w:color="cccccc" w:space="0" w:sz="4" w:val="single"/>
-            </w:tcBorders>
-            <w:shd w:fill="f5f5f5" w:val="clear"/>
-            <w:tcMar>
-              <w:top w:w="60.0" w:type="dxa"/>
-              <w:left w:w="100.0" w:type="dxa"/>
-              <w:bottom w:w="60.0" w:type="dxa"/>
-              <w:right w:w="100.0" w:type="dxa"/>
-            </w:tcMar>
-            <w:vAlign w:val="center"/>
-          </w:tcPr>
-          <w:p>
-            <w:pPr>
-              <w:spacing w:after="0" w:before="0" w:lineRule="auto"/>
-              <w:jc w:val="center"/>
-              <w:rPr/>
-            </w:pPr>
-            <w:r>
-              <w:rPr>
-                <w:rtl w:val="0"/>
-              </w:rPr>
-            </w:r>
-          </w:p>
-        </w:tc>
-        <w:tc>
-          <w:tcPr>
-            <w:tcBorders>
-              <w:top w:color="cccccc" w:space="0" w:sz="4" w:val="single"/>
-              <w:left w:color="cccccc" w:space="0" w:sz="4" w:val="single"/>
-              <w:bottom w:color="cccccc" w:space="0" w:sz="4" w:val="single"/>
-              <w:right w:color="cccccc" w:space="0" w:sz="4" w:val="single"/>
-            </w:tcBorders>
-            <w:shd w:fill="f5f5f5" w:val="clear"/>
-            <w:tcMar>
-              <w:top w:w="60.0" w:type="dxa"/>
-              <w:left w:w="100.0" w:type="dxa"/>
-              <w:bottom w:w="60.0" w:type="dxa"/>
-              <w:right w:w="100.0" w:type="dxa"/>
-            </w:tcMar>
-            <w:vAlign w:val="center"/>
-          </w:tcPr>
-          <w:p>
-            <w:pPr>
-              <w:spacing w:after="0" w:before="0" w:lineRule="auto"/>
-              <w:jc w:val="center"/>
-              <w:rPr/>
-            </w:pPr>
-            <w:r>
-              <w:rPr>
-                <w:rtl w:val="0"/>
-              </w:rPr>
+              <w:t>243,666</w:t>
+            </w:r>
+          </w:p>
+        </w:tc>
+        <w:tc>
+          <w:tcPr>
+            <w:tcBorders>
+              <w:top w:color="cccccc" w:space="0" w:sz="4" w:val="single"/>
+              <w:left w:color="cccccc" w:space="0" w:sz="4" w:val="single"/>
+              <w:bottom w:color="cccccc" w:space="0" w:sz="4" w:val="single"/>
+              <w:right w:color="cccccc" w:space="0" w:sz="4" w:val="single"/>
+            </w:tcBorders>
+            <w:shd w:fill="f5f5f5" w:val="clear"/>
+            <w:tcMar>
+              <w:top w:w="60.0" w:type="dxa"/>
+              <w:left w:w="100.0" w:type="dxa"/>
+              <w:bottom w:w="60.0" w:type="dxa"/>
+              <w:right w:w="100.0" w:type="dxa"/>
+            </w:tcMar>
+            <w:vAlign w:val="center"/>
+          </w:tcPr>
+          <w:p>
+            <w:pPr>
+              <w:spacing w:after="0" w:before="0" w:lineRule="auto"/>
+              <w:jc w:val="center"/>
+              <w:rPr/>
+            </w:pPr>
+            <w:r>
+              <w:rPr>
+                <w:rtl w:val="0"/>
+              </w:rPr>
+              <w:t>250,527</w:t>
+            </w:r>
+          </w:p>
+        </w:tc>
+        <w:tc>
+          <w:tcPr>
+            <w:tcBorders>
+              <w:top w:color="cccccc" w:space="0" w:sz="4" w:val="single"/>
+              <w:left w:color="cccccc" w:space="0" w:sz="4" w:val="single"/>
+              <w:bottom w:color="cccccc" w:space="0" w:sz="4" w:val="single"/>
+              <w:right w:color="cccccc" w:space="0" w:sz="4" w:val="single"/>
+            </w:tcBorders>
+            <w:shd w:fill="f5f5f5" w:val="clear"/>
+            <w:tcMar>
+              <w:top w:w="60.0" w:type="dxa"/>
+              <w:left w:w="100.0" w:type="dxa"/>
+              <w:bottom w:w="60.0" w:type="dxa"/>
+              <w:right w:w="100.0" w:type="dxa"/>
+            </w:tcMar>
+            <w:vAlign w:val="center"/>
+          </w:tcPr>
+          <w:p>
+            <w:pPr>
+              <w:spacing w:after="0" w:before="0" w:lineRule="auto"/>
+              <w:jc w:val="center"/>
+              <w:rPr/>
+            </w:pPr>
+            <w:r>
+              <w:rPr>
+                <w:rtl w:val="0"/>
+              </w:rPr>
+              <w:t>0.2437</w:t>
             </w:r>
           </w:p>
         </w:tc>
@@ -2613,6 +2631,7 @@
               <w:rPr>
                 <w:rtl w:val="0"/>
               </w:rPr>
+              <w:t>3,812,417</w:t>
             </w:r>
           </w:p>
         </w:tc>
@@ -2643,6 +2662,7 @@
               <w:rPr>
                 <w:rtl w:val="0"/>
               </w:rPr>
+              <w:t>6,258,503</w:t>
             </w:r>
           </w:p>
         </w:tc>
@@ -2673,6 +2693,7 @@
               <w:rPr>
                 <w:rtl w:val="0"/>
               </w:rPr>
+              <w:t>0.1525</w:t>
             </w:r>
           </w:p>
         </w:tc>
@@ -2819,66 +2840,69 @@
               <w:rPr>
                 <w:rtl w:val="0"/>
               </w:rPr>
-            </w:r>
-          </w:p>
-        </w:tc>
-        <w:tc>
-          <w:tcPr>
-            <w:tcBorders>
-              <w:top w:color="cccccc" w:space="0" w:sz="4" w:val="single"/>
-              <w:left w:color="cccccc" w:space="0" w:sz="4" w:val="single"/>
-              <w:bottom w:color="cccccc" w:space="0" w:sz="4" w:val="single"/>
-              <w:right w:color="cccccc" w:space="0" w:sz="4" w:val="single"/>
-            </w:tcBorders>
-            <w:shd w:fill="f5f5f5" w:val="clear"/>
-            <w:tcMar>
-              <w:top w:w="60.0" w:type="dxa"/>
-              <w:left w:w="100.0" w:type="dxa"/>
-              <w:bottom w:w="60.0" w:type="dxa"/>
-              <w:right w:w="100.0" w:type="dxa"/>
-            </w:tcMar>
-            <w:vAlign w:val="center"/>
-          </w:tcPr>
-          <w:p>
-            <w:pPr>
-              <w:spacing w:after="0" w:before="0" w:lineRule="auto"/>
-              <w:jc w:val="center"/>
-              <w:rPr/>
-            </w:pPr>
-            <w:r>
-              <w:rPr>
-                <w:rtl w:val="0"/>
-              </w:rPr>
-            </w:r>
-          </w:p>
-        </w:tc>
-        <w:tc>
-          <w:tcPr>
-            <w:tcBorders>
-              <w:top w:color="cccccc" w:space="0" w:sz="4" w:val="single"/>
-              <w:left w:color="cccccc" w:space="0" w:sz="4" w:val="single"/>
-              <w:bottom w:color="cccccc" w:space="0" w:sz="4" w:val="single"/>
-              <w:right w:color="cccccc" w:space="0" w:sz="4" w:val="single"/>
-            </w:tcBorders>
-            <w:shd w:fill="f5f5f5" w:val="clear"/>
-            <w:tcMar>
-              <w:top w:w="60.0" w:type="dxa"/>
-              <w:left w:w="100.0" w:type="dxa"/>
-              <w:bottom w:w="60.0" w:type="dxa"/>
-              <w:right w:w="100.0" w:type="dxa"/>
-            </w:tcMar>
-            <w:vAlign w:val="center"/>
-          </w:tcPr>
-          <w:p>
-            <w:pPr>
-              <w:spacing w:after="0" w:before="0" w:lineRule="auto"/>
-              <w:jc w:val="center"/>
-              <w:rPr/>
-            </w:pPr>
-            <w:r>
-              <w:rPr>
-                <w:rtl w:val="0"/>
-              </w:rPr>
+              <w:t>13,161,375</w:t>
+            </w:r>
+          </w:p>
+        </w:tc>
+        <w:tc>
+          <w:tcPr>
+            <w:tcBorders>
+              <w:top w:color="cccccc" w:space="0" w:sz="4" w:val="single"/>
+              <w:left w:color="cccccc" w:space="0" w:sz="4" w:val="single"/>
+              <w:bottom w:color="cccccc" w:space="0" w:sz="4" w:val="single"/>
+              <w:right w:color="cccccc" w:space="0" w:sz="4" w:val="single"/>
+            </w:tcBorders>
+            <w:shd w:fill="f5f5f5" w:val="clear"/>
+            <w:tcMar>
+              <w:top w:w="60.0" w:type="dxa"/>
+              <w:left w:w="100.0" w:type="dxa"/>
+              <w:bottom w:w="60.0" w:type="dxa"/>
+              <w:right w:w="100.0" w:type="dxa"/>
+            </w:tcMar>
+            <w:vAlign w:val="center"/>
+          </w:tcPr>
+          <w:p>
+            <w:pPr>
+              <w:spacing w:after="0" w:before="0" w:lineRule="auto"/>
+              <w:jc w:val="center"/>
+              <w:rPr/>
+            </w:pPr>
+            <w:r>
+              <w:rPr>
+                <w:rtl w:val="0"/>
+              </w:rPr>
+              <w:t>25,252,961</w:t>
+            </w:r>
+          </w:p>
+        </w:tc>
+        <w:tc>
+          <w:tcPr>
+            <w:tcBorders>
+              <w:top w:color="cccccc" w:space="0" w:sz="4" w:val="single"/>
+              <w:left w:color="cccccc" w:space="0" w:sz="4" w:val="single"/>
+              <w:bottom w:color="cccccc" w:space="0" w:sz="4" w:val="single"/>
+              <w:right w:color="cccccc" w:space="0" w:sz="4" w:val="single"/>
+            </w:tcBorders>
+            <w:shd w:fill="f5f5f5" w:val="clear"/>
+            <w:tcMar>
+              <w:top w:w="60.0" w:type="dxa"/>
+              <w:left w:w="100.0" w:type="dxa"/>
+              <w:bottom w:w="60.0" w:type="dxa"/>
+              <w:right w:w="100.0" w:type="dxa"/>
+            </w:tcMar>
+            <w:vAlign w:val="center"/>
+          </w:tcPr>
+          <w:p>
+            <w:pPr>
+              <w:spacing w:after="0" w:before="0" w:lineRule="auto"/>
+              <w:jc w:val="center"/>
+              <w:rPr/>
+            </w:pPr>
+            <w:r>
+              <w:rPr>
+                <w:rtl w:val="0"/>
+              </w:rPr>
+              <w:t>0.1316</w:t>
             </w:r>
           </w:p>
         </w:tc>
@@ -3025,6 +3049,7 @@
               <w:rPr>
                 <w:rtl w:val="0"/>
               </w:rPr>
+              <w:t>80,785,167</w:t>
             </w:r>
           </w:p>
         </w:tc>
@@ -3055,6 +3080,7 @@
               <w:rPr>
                 <w:rtl w:val="0"/>
               </w:rPr>
+              <w:t>156,116,762</w:t>
             </w:r>
           </w:p>
         </w:tc>
@@ -3085,6 +3111,7 @@
               <w:rPr>
                 <w:rtl w:val="0"/>
               </w:rPr>
+              <w:t>0.1293</w:t>
             </w:r>
           </w:p>
         </w:tc>
@@ -3231,66 +3258,69 @@
               <w:rPr>
                 <w:rtl w:val="0"/>
               </w:rPr>
-            </w:r>
-          </w:p>
-        </w:tc>
-        <w:tc>
-          <w:tcPr>
-            <w:tcBorders>
-              <w:top w:color="cccccc" w:space="0" w:sz="4" w:val="single"/>
-              <w:left w:color="cccccc" w:space="0" w:sz="4" w:val="single"/>
-              <w:bottom w:color="cccccc" w:space="0" w:sz="4" w:val="single"/>
-              <w:right w:color="cccccc" w:space="0" w:sz="4" w:val="single"/>
-            </w:tcBorders>
-            <w:shd w:fill="f5f5f5" w:val="clear"/>
-            <w:tcMar>
-              <w:top w:w="60.0" w:type="dxa"/>
-              <w:left w:w="100.0" w:type="dxa"/>
-              <w:bottom w:w="60.0" w:type="dxa"/>
-              <w:right w:w="100.0" w:type="dxa"/>
-            </w:tcMar>
-            <w:vAlign w:val="center"/>
-          </w:tcPr>
-          <w:p>
-            <w:pPr>
-              <w:spacing w:after="0" w:before="0" w:lineRule="auto"/>
-              <w:jc w:val="center"/>
-              <w:rPr/>
-            </w:pPr>
-            <w:r>
-              <w:rPr>
-                <w:rtl w:val="0"/>
-              </w:rPr>
-            </w:r>
-          </w:p>
-        </w:tc>
-        <w:tc>
-          <w:tcPr>
-            <w:tcBorders>
-              <w:top w:color="cccccc" w:space="0" w:sz="4" w:val="single"/>
-              <w:left w:color="cccccc" w:space="0" w:sz="4" w:val="single"/>
-              <w:bottom w:color="cccccc" w:space="0" w:sz="4" w:val="single"/>
-              <w:right w:color="cccccc" w:space="0" w:sz="4" w:val="single"/>
-            </w:tcBorders>
-            <w:shd w:fill="f5f5f5" w:val="clear"/>
-            <w:tcMar>
-              <w:top w:w="60.0" w:type="dxa"/>
-              <w:left w:w="100.0" w:type="dxa"/>
-              <w:bottom w:w="60.0" w:type="dxa"/>
-              <w:right w:w="100.0" w:type="dxa"/>
-            </w:tcMar>
-            <w:vAlign w:val="center"/>
-          </w:tcPr>
-          <w:p>
-            <w:pPr>
-              <w:spacing w:after="0" w:before="0" w:lineRule="auto"/>
-              <w:jc w:val="center"/>
-              <w:rPr/>
-            </w:pPr>
-            <w:r>
-              <w:rPr>
-                <w:rtl w:val="0"/>
-              </w:rPr>
+              <w:t>342,701,333</w:t>
+            </w:r>
+          </w:p>
+        </w:tc>
+        <w:tc>
+          <w:tcPr>
+            <w:tcBorders>
+              <w:top w:color="cccccc" w:space="0" w:sz="4" w:val="single"/>
+              <w:left w:color="cccccc" w:space="0" w:sz="4" w:val="single"/>
+              <w:bottom w:color="cccccc" w:space="0" w:sz="4" w:val="single"/>
+              <w:right w:color="cccccc" w:space="0" w:sz="4" w:val="single"/>
+            </w:tcBorders>
+            <w:shd w:fill="f5f5f5" w:val="clear"/>
+            <w:tcMar>
+              <w:top w:w="60.0" w:type="dxa"/>
+              <w:left w:w="100.0" w:type="dxa"/>
+              <w:bottom w:w="60.0" w:type="dxa"/>
+              <w:right w:w="100.0" w:type="dxa"/>
+            </w:tcMar>
+            <w:vAlign w:val="center"/>
+          </w:tcPr>
+          <w:p>
+            <w:pPr>
+              <w:spacing w:after="0" w:before="0" w:lineRule="auto"/>
+              <w:jc w:val="center"/>
+              <w:rPr/>
+            </w:pPr>
+            <w:r>
+              <w:rPr>
+                <w:rtl w:val="0"/>
+              </w:rPr>
+              <w:t>623,781,938</w:t>
+            </w:r>
+          </w:p>
+        </w:tc>
+        <w:tc>
+          <w:tcPr>
+            <w:tcBorders>
+              <w:top w:color="cccccc" w:space="0" w:sz="4" w:val="single"/>
+              <w:left w:color="cccccc" w:space="0" w:sz="4" w:val="single"/>
+              <w:bottom w:color="cccccc" w:space="0" w:sz="4" w:val="single"/>
+              <w:right w:color="cccccc" w:space="0" w:sz="4" w:val="single"/>
+            </w:tcBorders>
+            <w:shd w:fill="f5f5f5" w:val="clear"/>
+            <w:tcMar>
+              <w:top w:w="60.0" w:type="dxa"/>
+              <w:left w:w="100.0" w:type="dxa"/>
+              <w:bottom w:w="60.0" w:type="dxa"/>
+              <w:right w:w="100.0" w:type="dxa"/>
+            </w:tcMar>
+            <w:vAlign w:val="center"/>
+          </w:tcPr>
+          <w:p>
+            <w:pPr>
+              <w:spacing w:after="0" w:before="0" w:lineRule="auto"/>
+              <w:jc w:val="center"/>
+              <w:rPr/>
+            </w:pPr>
+            <w:r>
+              <w:rPr>
+                <w:rtl w:val="0"/>
+              </w:rPr>
+              <w:t>0.1371</w:t>
             </w:r>
           </w:p>
         </w:tc>
@@ -3868,66 +3898,69 @@
               <w:rPr>
                 <w:rtl w:val="0"/>
               </w:rPr>
-            </w:r>
-          </w:p>
-        </w:tc>
-        <w:tc>
-          <w:tcPr>
-            <w:tcBorders>
-              <w:top w:color="cccccc" w:space="0" w:sz="4" w:val="single"/>
-              <w:left w:color="cccccc" w:space="0" w:sz="4" w:val="single"/>
-              <w:bottom w:color="cccccc" w:space="0" w:sz="4" w:val="single"/>
-              <w:right w:color="cccccc" w:space="0" w:sz="4" w:val="single"/>
-            </w:tcBorders>
-            <w:shd w:fill="f5f5f5" w:val="clear"/>
-            <w:tcMar>
-              <w:top w:w="60.0" w:type="dxa"/>
-              <w:left w:w="100.0" w:type="dxa"/>
-              <w:bottom w:w="60.0" w:type="dxa"/>
-              <w:right w:w="100.0" w:type="dxa"/>
-            </w:tcMar>
-            <w:vAlign w:val="center"/>
-          </w:tcPr>
-          <w:p>
-            <w:pPr>
-              <w:spacing w:after="0" w:before="0" w:lineRule="auto"/>
-              <w:jc w:val="center"/>
-              <w:rPr/>
-            </w:pPr>
-            <w:r>
-              <w:rPr>
-                <w:rtl w:val="0"/>
-              </w:rPr>
-            </w:r>
-          </w:p>
-        </w:tc>
-        <w:tc>
-          <w:tcPr>
-            <w:tcBorders>
-              <w:top w:color="cccccc" w:space="0" w:sz="4" w:val="single"/>
-              <w:left w:color="cccccc" w:space="0" w:sz="4" w:val="single"/>
-              <w:bottom w:color="cccccc" w:space="0" w:sz="4" w:val="single"/>
-              <w:right w:color="cccccc" w:space="0" w:sz="4" w:val="single"/>
-            </w:tcBorders>
-            <w:shd w:fill="f5f5f5" w:val="clear"/>
-            <w:tcMar>
-              <w:top w:w="60.0" w:type="dxa"/>
-              <w:left w:w="100.0" w:type="dxa"/>
-              <w:bottom w:w="60.0" w:type="dxa"/>
-              <w:right w:w="100.0" w:type="dxa"/>
-            </w:tcMar>
-            <w:vAlign w:val="center"/>
-          </w:tcPr>
-          <w:p>
-            <w:pPr>
-              <w:spacing w:after="0" w:before="0" w:lineRule="auto"/>
-              <w:jc w:val="center"/>
-              <w:rPr/>
-            </w:pPr>
-            <w:r>
-              <w:rPr>
-                <w:rtl w:val="0"/>
-              </w:rPr>
+              <w:t>278,208</w:t>
+            </w:r>
+          </w:p>
+        </w:tc>
+        <w:tc>
+          <w:tcPr>
+            <w:tcBorders>
+              <w:top w:color="cccccc" w:space="0" w:sz="4" w:val="single"/>
+              <w:left w:color="cccccc" w:space="0" w:sz="4" w:val="single"/>
+              <w:bottom w:color="cccccc" w:space="0" w:sz="4" w:val="single"/>
+              <w:right w:color="cccccc" w:space="0" w:sz="4" w:val="single"/>
+            </w:tcBorders>
+            <w:shd w:fill="f5f5f5" w:val="clear"/>
+            <w:tcMar>
+              <w:top w:w="60.0" w:type="dxa"/>
+              <w:left w:w="100.0" w:type="dxa"/>
+              <w:bottom w:w="60.0" w:type="dxa"/>
+              <w:right w:w="100.0" w:type="dxa"/>
+            </w:tcMar>
+            <w:vAlign w:val="center"/>
+          </w:tcPr>
+          <w:p>
+            <w:pPr>
+              <w:spacing w:after="0" w:before="0" w:lineRule="auto"/>
+              <w:jc w:val="center"/>
+              <w:rPr/>
+            </w:pPr>
+            <w:r>
+              <w:rPr>
+                <w:rtl w:val="0"/>
+              </w:rPr>
+              <w:t>499,500</w:t>
+            </w:r>
+          </w:p>
+        </w:tc>
+        <w:tc>
+          <w:tcPr>
+            <w:tcBorders>
+              <w:top w:color="cccccc" w:space="0" w:sz="4" w:val="single"/>
+              <w:left w:color="cccccc" w:space="0" w:sz="4" w:val="single"/>
+              <w:bottom w:color="cccccc" w:space="0" w:sz="4" w:val="single"/>
+              <w:right w:color="cccccc" w:space="0" w:sz="4" w:val="single"/>
+            </w:tcBorders>
+            <w:shd w:fill="f5f5f5" w:val="clear"/>
+            <w:tcMar>
+              <w:top w:w="60.0" w:type="dxa"/>
+              <w:left w:w="100.0" w:type="dxa"/>
+              <w:bottom w:w="60.0" w:type="dxa"/>
+              <w:right w:w="100.0" w:type="dxa"/>
+            </w:tcMar>
+            <w:vAlign w:val="center"/>
+          </w:tcPr>
+          <w:p>
+            <w:pPr>
+              <w:spacing w:after="0" w:before="0" w:lineRule="auto"/>
+              <w:jc w:val="center"/>
+              <w:rPr/>
+            </w:pPr>
+            <w:r>
+              <w:rPr>
+                <w:rtl w:val="0"/>
+              </w:rPr>
+              <w:t>0.2782</w:t>
             </w:r>
           </w:p>
         </w:tc>
@@ -4074,6 +4107,7 @@
               <w:rPr>
                 <w:rtl w:val="0"/>
               </w:rPr>
+              <w:t>6,492,000</w:t>
             </w:r>
           </w:p>
         </w:tc>
@@ -4104,6 +4138,7 @@
               <w:rPr>
                 <w:rtl w:val="0"/>
               </w:rPr>
+              <w:t>12,497,500</w:t>
             </w:r>
           </w:p>
         </w:tc>
@@ -4134,6 +4169,7 @@
               <w:rPr>
                 <w:rtl w:val="0"/>
               </w:rPr>
+              <w:t>0.2597</w:t>
             </w:r>
           </w:p>
         </w:tc>
@@ -4280,66 +4316,69 @@
               <w:rPr>
                 <w:rtl w:val="0"/>
               </w:rPr>
-            </w:r>
-          </w:p>
-        </w:tc>
-        <w:tc>
-          <w:tcPr>
-            <w:tcBorders>
-              <w:top w:color="cccccc" w:space="0" w:sz="4" w:val="single"/>
-              <w:left w:color="cccccc" w:space="0" w:sz="4" w:val="single"/>
-              <w:bottom w:color="cccccc" w:space="0" w:sz="4" w:val="single"/>
-              <w:right w:color="cccccc" w:space="0" w:sz="4" w:val="single"/>
-            </w:tcBorders>
-            <w:shd w:fill="f5f5f5" w:val="clear"/>
-            <w:tcMar>
-              <w:top w:w="60.0" w:type="dxa"/>
-              <w:left w:w="100.0" w:type="dxa"/>
-              <w:bottom w:w="60.0" w:type="dxa"/>
-              <w:right w:w="100.0" w:type="dxa"/>
-            </w:tcMar>
-            <w:vAlign w:val="center"/>
-          </w:tcPr>
-          <w:p>
-            <w:pPr>
-              <w:spacing w:after="0" w:before="0" w:lineRule="auto"/>
-              <w:jc w:val="center"/>
-              <w:rPr/>
-            </w:pPr>
-            <w:r>
-              <w:rPr>
-                <w:rtl w:val="0"/>
-              </w:rPr>
-            </w:r>
-          </w:p>
-        </w:tc>
-        <w:tc>
-          <w:tcPr>
-            <w:tcBorders>
-              <w:top w:color="cccccc" w:space="0" w:sz="4" w:val="single"/>
-              <w:left w:color="cccccc" w:space="0" w:sz="4" w:val="single"/>
-              <w:bottom w:color="cccccc" w:space="0" w:sz="4" w:val="single"/>
-              <w:right w:color="cccccc" w:space="0" w:sz="4" w:val="single"/>
-            </w:tcBorders>
-            <w:shd w:fill="f5f5f5" w:val="clear"/>
-            <w:tcMar>
-              <w:top w:w="60.0" w:type="dxa"/>
-              <w:left w:w="100.0" w:type="dxa"/>
-              <w:bottom w:w="60.0" w:type="dxa"/>
-              <w:right w:w="100.0" w:type="dxa"/>
-            </w:tcMar>
-            <w:vAlign w:val="center"/>
-          </w:tcPr>
-          <w:p>
-            <w:pPr>
-              <w:spacing w:after="0" w:before="0" w:lineRule="auto"/>
-              <w:jc w:val="center"/>
-              <w:rPr/>
-            </w:pPr>
-            <w:r>
-              <w:rPr>
-                <w:rtl w:val="0"/>
-              </w:rPr>
+              <w:t>25,773,833</w:t>
+            </w:r>
+          </w:p>
+        </w:tc>
+        <w:tc>
+          <w:tcPr>
+            <w:tcBorders>
+              <w:top w:color="cccccc" w:space="0" w:sz="4" w:val="single"/>
+              <w:left w:color="cccccc" w:space="0" w:sz="4" w:val="single"/>
+              <w:bottom w:color="cccccc" w:space="0" w:sz="4" w:val="single"/>
+              <w:right w:color="cccccc" w:space="0" w:sz="4" w:val="single"/>
+            </w:tcBorders>
+            <w:shd w:fill="f5f5f5" w:val="clear"/>
+            <w:tcMar>
+              <w:top w:w="60.0" w:type="dxa"/>
+              <w:left w:w="100.0" w:type="dxa"/>
+              <w:bottom w:w="60.0" w:type="dxa"/>
+              <w:right w:w="100.0" w:type="dxa"/>
+            </w:tcMar>
+            <w:vAlign w:val="center"/>
+          </w:tcPr>
+          <w:p>
+            <w:pPr>
+              <w:spacing w:after="0" w:before="0" w:lineRule="auto"/>
+              <w:jc w:val="center"/>
+              <w:rPr/>
+            </w:pPr>
+            <w:r>
+              <w:rPr>
+                <w:rtl w:val="0"/>
+              </w:rPr>
+              <w:t>49,995,000</w:t>
+            </w:r>
+          </w:p>
+        </w:tc>
+        <w:tc>
+          <w:tcPr>
+            <w:tcBorders>
+              <w:top w:color="cccccc" w:space="0" w:sz="4" w:val="single"/>
+              <w:left w:color="cccccc" w:space="0" w:sz="4" w:val="single"/>
+              <w:bottom w:color="cccccc" w:space="0" w:sz="4" w:val="single"/>
+              <w:right w:color="cccccc" w:space="0" w:sz="4" w:val="single"/>
+            </w:tcBorders>
+            <w:shd w:fill="f5f5f5" w:val="clear"/>
+            <w:tcMar>
+              <w:top w:w="60.0" w:type="dxa"/>
+              <w:left w:w="100.0" w:type="dxa"/>
+              <w:bottom w:w="60.0" w:type="dxa"/>
+              <w:right w:w="100.0" w:type="dxa"/>
+            </w:tcMar>
+            <w:vAlign w:val="center"/>
+          </w:tcPr>
+          <w:p>
+            <w:pPr>
+              <w:spacing w:after="0" w:before="0" w:lineRule="auto"/>
+              <w:jc w:val="center"/>
+              <w:rPr/>
+            </w:pPr>
+            <w:r>
+              <w:rPr>
+                <w:rtl w:val="0"/>
+              </w:rPr>
+              <w:t>0.2577</w:t>
             </w:r>
           </w:p>
         </w:tc>
@@ -4486,6 +4525,7 @@
               <w:rPr>
                 <w:rtl w:val="0"/>
               </w:rPr>
+              <w:t>162,781,208</w:t>
             </w:r>
           </w:p>
         </w:tc>
@@ -4516,6 +4556,7 @@
               <w:rPr>
                 <w:rtl w:val="0"/>
               </w:rPr>
+              <w:t>312,487,500</w:t>
             </w:r>
           </w:p>
         </w:tc>
@@ -4546,6 +4587,7 @@
               <w:rPr>
                 <w:rtl w:val="0"/>
               </w:rPr>
+              <w:t>0.2604</w:t>
             </w:r>
           </w:p>
         </w:tc>
@@ -4692,66 +4734,69 @@
               <w:rPr>
                 <w:rtl w:val="0"/>
               </w:rPr>
-            </w:r>
-          </w:p>
-        </w:tc>
-        <w:tc>
-          <w:tcPr>
-            <w:tcBorders>
-              <w:top w:color="cccccc" w:space="0" w:sz="4" w:val="single"/>
-              <w:left w:color="cccccc" w:space="0" w:sz="4" w:val="single"/>
-              <w:bottom w:color="cccccc" w:space="0" w:sz="4" w:val="single"/>
-              <w:right w:color="cccccc" w:space="0" w:sz="4" w:val="single"/>
-            </w:tcBorders>
-            <w:shd w:fill="f5f5f5" w:val="clear"/>
-            <w:tcMar>
-              <w:top w:w="60.0" w:type="dxa"/>
-              <w:left w:w="100.0" w:type="dxa"/>
-              <w:bottom w:w="60.0" w:type="dxa"/>
-              <w:right w:w="100.0" w:type="dxa"/>
-            </w:tcMar>
-            <w:vAlign w:val="center"/>
-          </w:tcPr>
-          <w:p>
-            <w:pPr>
-              <w:spacing w:after="0" w:before="0" w:lineRule="auto"/>
-              <w:jc w:val="center"/>
-              <w:rPr/>
-            </w:pPr>
-            <w:r>
-              <w:rPr>
-                <w:rtl w:val="0"/>
-              </w:rPr>
-            </w:r>
-          </w:p>
-        </w:tc>
-        <w:tc>
-          <w:tcPr>
-            <w:tcBorders>
-              <w:top w:color="cccccc" w:space="0" w:sz="4" w:val="single"/>
-              <w:left w:color="cccccc" w:space="0" w:sz="4" w:val="single"/>
-              <w:bottom w:color="cccccc" w:space="0" w:sz="4" w:val="single"/>
-              <w:right w:color="cccccc" w:space="0" w:sz="4" w:val="single"/>
-            </w:tcBorders>
-            <w:shd w:fill="f5f5f5" w:val="clear"/>
-            <w:tcMar>
-              <w:top w:w="60.0" w:type="dxa"/>
-              <w:left w:w="100.0" w:type="dxa"/>
-              <w:bottom w:w="60.0" w:type="dxa"/>
-              <w:right w:w="100.0" w:type="dxa"/>
-            </w:tcMar>
-            <w:vAlign w:val="center"/>
-          </w:tcPr>
-          <w:p>
-            <w:pPr>
-              <w:spacing w:after="0" w:before="0" w:lineRule="auto"/>
-              <w:jc w:val="center"/>
-              <w:rPr/>
-            </w:pPr>
-            <w:r>
-              <w:rPr>
-                <w:rtl w:val="0"/>
-              </w:rPr>
+              <w:t>677,643,208</w:t>
+            </w:r>
+          </w:p>
+        </w:tc>
+        <w:tc>
+          <w:tcPr>
+            <w:tcBorders>
+              <w:top w:color="cccccc" w:space="0" w:sz="4" w:val="single"/>
+              <w:left w:color="cccccc" w:space="0" w:sz="4" w:val="single"/>
+              <w:bottom w:color="cccccc" w:space="0" w:sz="4" w:val="single"/>
+              <w:right w:color="cccccc" w:space="0" w:sz="4" w:val="single"/>
+            </w:tcBorders>
+            <w:shd w:fill="f5f5f5" w:val="clear"/>
+            <w:tcMar>
+              <w:top w:w="60.0" w:type="dxa"/>
+              <w:left w:w="100.0" w:type="dxa"/>
+              <w:bottom w:w="60.0" w:type="dxa"/>
+              <w:right w:w="100.0" w:type="dxa"/>
+            </w:tcMar>
+            <w:vAlign w:val="center"/>
+          </w:tcPr>
+          <w:p>
+            <w:pPr>
+              <w:spacing w:after="0" w:before="0" w:lineRule="auto"/>
+              <w:jc w:val="center"/>
+              <w:rPr/>
+            </w:pPr>
+            <w:r>
+              <w:rPr>
+                <w:rtl w:val="0"/>
+              </w:rPr>
+              <w:t>1,249,975,000</w:t>
+            </w:r>
+          </w:p>
+        </w:tc>
+        <w:tc>
+          <w:tcPr>
+            <w:tcBorders>
+              <w:top w:color="cccccc" w:space="0" w:sz="4" w:val="single"/>
+              <w:left w:color="cccccc" w:space="0" w:sz="4" w:val="single"/>
+              <w:bottom w:color="cccccc" w:space="0" w:sz="4" w:val="single"/>
+              <w:right w:color="cccccc" w:space="0" w:sz="4" w:val="single"/>
+            </w:tcBorders>
+            <w:shd w:fill="f5f5f5" w:val="clear"/>
+            <w:tcMar>
+              <w:top w:w="60.0" w:type="dxa"/>
+              <w:left w:w="100.0" w:type="dxa"/>
+              <w:bottom w:w="60.0" w:type="dxa"/>
+              <w:right w:w="100.0" w:type="dxa"/>
+            </w:tcMar>
+            <w:vAlign w:val="center"/>
+          </w:tcPr>
+          <w:p>
+            <w:pPr>
+              <w:spacing w:after="0" w:before="0" w:lineRule="auto"/>
+              <w:jc w:val="center"/>
+              <w:rPr/>
+            </w:pPr>
+            <w:r>
+              <w:rPr>
+                <w:rtl w:val="0"/>
+              </w:rPr>
+              <w:t>0.2711</w:t>
             </w:r>
           </w:p>
         </w:tc>
@@ -5590,66 +5635,69 @@
               <w:rPr>
                 <w:rtl w:val="0"/>
               </w:rPr>
-            </w:r>
-          </w:p>
-        </w:tc>
-        <w:tc>
-          <w:tcPr>
-            <w:tcBorders>
-              <w:top w:color="cccccc" w:space="0" w:sz="4" w:val="single"/>
-              <w:left w:color="cccccc" w:space="0" w:sz="4" w:val="single"/>
-              <w:bottom w:color="cccccc" w:space="0" w:sz="4" w:val="single"/>
-              <w:right w:color="cccccc" w:space="0" w:sz="4" w:val="single"/>
-            </w:tcBorders>
-            <w:shd w:fill="f5f5f5" w:val="clear"/>
-            <w:tcMar>
-              <w:top w:w="60.0" w:type="dxa"/>
-              <w:left w:w="100.0" w:type="dxa"/>
-              <w:bottom w:w="60.0" w:type="dxa"/>
-              <w:right w:w="100.0" w:type="dxa"/>
-            </w:tcMar>
-            <w:vAlign w:val="center"/>
-          </w:tcPr>
-          <w:p>
-            <w:pPr>
-              <w:spacing w:after="0" w:before="0" w:lineRule="auto"/>
-              <w:jc w:val="center"/>
-              <w:rPr/>
-            </w:pPr>
-            <w:r>
-              <w:rPr>
-                <w:rtl w:val="0"/>
-              </w:rPr>
-            </w:r>
-          </w:p>
-        </w:tc>
-        <w:tc>
-          <w:tcPr>
-            <w:tcBorders>
-              <w:top w:color="cccccc" w:space="0" w:sz="4" w:val="single"/>
-              <w:left w:color="cccccc" w:space="0" w:sz="4" w:val="single"/>
-              <w:bottom w:color="cccccc" w:space="0" w:sz="4" w:val="single"/>
-              <w:right w:color="cccccc" w:space="0" w:sz="4" w:val="single"/>
-            </w:tcBorders>
-            <w:shd w:fill="f5f5f5" w:val="clear"/>
-            <w:tcMar>
-              <w:top w:w="60.0" w:type="dxa"/>
-              <w:left w:w="100.0" w:type="dxa"/>
-              <w:bottom w:w="60.0" w:type="dxa"/>
-              <w:right w:w="100.0" w:type="dxa"/>
-            </w:tcMar>
-            <w:vAlign w:val="center"/>
-          </w:tcPr>
-          <w:p>
-            <w:pPr>
-              <w:spacing w:after="0" w:before="0" w:lineRule="auto"/>
-              <w:jc w:val="center"/>
-              <w:rPr/>
-            </w:pPr>
-            <w:r>
-              <w:rPr>
-                <w:rtl w:val="0"/>
-              </w:rPr>
+              <w:t>1,671,500</w:t>
+            </w:r>
+          </w:p>
+        </w:tc>
+        <w:tc>
+          <w:tcPr>
+            <w:tcBorders>
+              <w:top w:color="cccccc" w:space="0" w:sz="4" w:val="single"/>
+              <w:left w:color="cccccc" w:space="0" w:sz="4" w:val="single"/>
+              <w:bottom w:color="cccccc" w:space="0" w:sz="4" w:val="single"/>
+              <w:right w:color="cccccc" w:space="0" w:sz="4" w:val="single"/>
+            </w:tcBorders>
+            <w:shd w:fill="f5f5f5" w:val="clear"/>
+            <w:tcMar>
+              <w:top w:w="60.0" w:type="dxa"/>
+              <w:left w:w="100.0" w:type="dxa"/>
+              <w:bottom w:w="60.0" w:type="dxa"/>
+              <w:right w:w="100.0" w:type="dxa"/>
+            </w:tcMar>
+            <w:vAlign w:val="center"/>
+          </w:tcPr>
+          <w:p>
+            <w:pPr>
+              <w:spacing w:after="0" w:before="0" w:lineRule="auto"/>
+              <w:jc w:val="center"/>
+              <w:rPr/>
+            </w:pPr>
+            <w:r>
+              <w:rPr>
+                <w:rtl w:val="0"/>
+              </w:rPr>
+              <w:t>499,500</w:t>
+            </w:r>
+          </w:p>
+        </w:tc>
+        <w:tc>
+          <w:tcPr>
+            <w:tcBorders>
+              <w:top w:color="cccccc" w:space="0" w:sz="4" w:val="single"/>
+              <w:left w:color="cccccc" w:space="0" w:sz="4" w:val="single"/>
+              <w:bottom w:color="cccccc" w:space="0" w:sz="4" w:val="single"/>
+              <w:right w:color="cccccc" w:space="0" w:sz="4" w:val="single"/>
+            </w:tcBorders>
+            <w:shd w:fill="f5f5f5" w:val="clear"/>
+            <w:tcMar>
+              <w:top w:w="60.0" w:type="dxa"/>
+              <w:left w:w="100.0" w:type="dxa"/>
+              <w:bottom w:w="60.0" w:type="dxa"/>
+              <w:right w:w="100.0" w:type="dxa"/>
+            </w:tcMar>
+            <w:vAlign w:val="center"/>
+          </w:tcPr>
+          <w:p>
+            <w:pPr>
+              <w:spacing w:after="0" w:before="0" w:lineRule="auto"/>
+              <w:jc w:val="center"/>
+              <w:rPr/>
+            </w:pPr>
+            <w:r>
+              <w:rPr>
+                <w:rtl w:val="0"/>
+              </w:rPr>
+              <w:t>1.6715</w:t>
             </w:r>
           </w:p>
         </w:tc>
@@ -5796,6 +5844,7 @@
               <w:rPr>
                 <w:rtl w:val="0"/>
               </w:rPr>
+              <w:t>9,538,500</w:t>
             </w:r>
           </w:p>
         </w:tc>
@@ -5826,6 +5875,7 @@
               <w:rPr>
                 <w:rtl w:val="0"/>
               </w:rPr>
+              <w:t>12,497,500</w:t>
             </w:r>
           </w:p>
         </w:tc>
@@ -5856,6 +5906,7 @@
               <w:rPr>
                 <w:rtl w:val="0"/>
               </w:rPr>
+              <w:t>0.3815</w:t>
             </w:r>
           </w:p>
         </w:tc>
@@ -6002,66 +6053,69 @@
               <w:rPr>
                 <w:rtl w:val="0"/>
               </w:rPr>
-            </w:r>
-          </w:p>
-        </w:tc>
-        <w:tc>
-          <w:tcPr>
-            <w:tcBorders>
-              <w:top w:color="cccccc" w:space="0" w:sz="4" w:val="single"/>
-              <w:left w:color="cccccc" w:space="0" w:sz="4" w:val="single"/>
-              <w:bottom w:color="cccccc" w:space="0" w:sz="4" w:val="single"/>
-              <w:right w:color="cccccc" w:space="0" w:sz="4" w:val="single"/>
-            </w:tcBorders>
-            <w:shd w:fill="f5f5f5" w:val="clear"/>
-            <w:tcMar>
-              <w:top w:w="60.0" w:type="dxa"/>
-              <w:left w:w="100.0" w:type="dxa"/>
-              <w:bottom w:w="60.0" w:type="dxa"/>
-              <w:right w:w="100.0" w:type="dxa"/>
-            </w:tcMar>
-            <w:vAlign w:val="center"/>
-          </w:tcPr>
-          <w:p>
-            <w:pPr>
-              <w:spacing w:after="0" w:before="0" w:lineRule="auto"/>
-              <w:jc w:val="center"/>
-              <w:rPr/>
-            </w:pPr>
-            <w:r>
-              <w:rPr>
-                <w:rtl w:val="0"/>
-              </w:rPr>
-            </w:r>
-          </w:p>
-        </w:tc>
-        <w:tc>
-          <w:tcPr>
-            <w:tcBorders>
-              <w:top w:color="cccccc" w:space="0" w:sz="4" w:val="single"/>
-              <w:left w:color="cccccc" w:space="0" w:sz="4" w:val="single"/>
-              <w:bottom w:color="cccccc" w:space="0" w:sz="4" w:val="single"/>
-              <w:right w:color="cccccc" w:space="0" w:sz="4" w:val="single"/>
-            </w:tcBorders>
-            <w:shd w:fill="f5f5f5" w:val="clear"/>
-            <w:tcMar>
-              <w:top w:w="60.0" w:type="dxa"/>
-              <w:left w:w="100.0" w:type="dxa"/>
-              <w:bottom w:w="60.0" w:type="dxa"/>
-              <w:right w:w="100.0" w:type="dxa"/>
-            </w:tcMar>
-            <w:vAlign w:val="center"/>
-          </w:tcPr>
-          <w:p>
-            <w:pPr>
-              <w:spacing w:after="0" w:before="0" w:lineRule="auto"/>
-              <w:jc w:val="center"/>
-              <w:rPr/>
-            </w:pPr>
-            <w:r>
-              <w:rPr>
-                <w:rtl w:val="0"/>
-              </w:rPr>
+              <w:t>32,404,875</w:t>
+            </w:r>
+          </w:p>
+        </w:tc>
+        <w:tc>
+          <w:tcPr>
+            <w:tcBorders>
+              <w:top w:color="cccccc" w:space="0" w:sz="4" w:val="single"/>
+              <w:left w:color="cccccc" w:space="0" w:sz="4" w:val="single"/>
+              <w:bottom w:color="cccccc" w:space="0" w:sz="4" w:val="single"/>
+              <w:right w:color="cccccc" w:space="0" w:sz="4" w:val="single"/>
+            </w:tcBorders>
+            <w:shd w:fill="f5f5f5" w:val="clear"/>
+            <w:tcMar>
+              <w:top w:w="60.0" w:type="dxa"/>
+              <w:left w:w="100.0" w:type="dxa"/>
+              <w:bottom w:w="60.0" w:type="dxa"/>
+              <w:right w:w="100.0" w:type="dxa"/>
+            </w:tcMar>
+            <w:vAlign w:val="center"/>
+          </w:tcPr>
+          <w:p>
+            <w:pPr>
+              <w:spacing w:after="0" w:before="0" w:lineRule="auto"/>
+              <w:jc w:val="center"/>
+              <w:rPr/>
+            </w:pPr>
+            <w:r>
+              <w:rPr>
+                <w:rtl w:val="0"/>
+              </w:rPr>
+              <w:t>49,995,000</w:t>
+            </w:r>
+          </w:p>
+        </w:tc>
+        <w:tc>
+          <w:tcPr>
+            <w:tcBorders>
+              <w:top w:color="cccccc" w:space="0" w:sz="4" w:val="single"/>
+              <w:left w:color="cccccc" w:space="0" w:sz="4" w:val="single"/>
+              <w:bottom w:color="cccccc" w:space="0" w:sz="4" w:val="single"/>
+              <w:right w:color="cccccc" w:space="0" w:sz="4" w:val="single"/>
+            </w:tcBorders>
+            <w:shd w:fill="f5f5f5" w:val="clear"/>
+            <w:tcMar>
+              <w:top w:w="60.0" w:type="dxa"/>
+              <w:left w:w="100.0" w:type="dxa"/>
+              <w:bottom w:w="60.0" w:type="dxa"/>
+              <w:right w:w="100.0" w:type="dxa"/>
+            </w:tcMar>
+            <w:vAlign w:val="center"/>
+          </w:tcPr>
+          <w:p>
+            <w:pPr>
+              <w:spacing w:after="0" w:before="0" w:lineRule="auto"/>
+              <w:jc w:val="center"/>
+              <w:rPr/>
+            </w:pPr>
+            <w:r>
+              <w:rPr>
+                <w:rtl w:val="0"/>
+              </w:rPr>
+              <w:t>0.3240</w:t>
             </w:r>
           </w:p>
         </w:tc>
@@ -6208,6 +6262,7 @@
               <w:rPr>
                 <w:rtl w:val="0"/>
               </w:rPr>
+              <w:t>183,913,916</w:t>
             </w:r>
           </w:p>
         </w:tc>
@@ -6238,6 +6293,7 @@
               <w:rPr>
                 <w:rtl w:val="0"/>
               </w:rPr>
+              <w:t>312,487,500</w:t>
             </w:r>
           </w:p>
         </w:tc>
@@ -6268,6 +6324,7 @@
               <w:rPr>
                 <w:rtl w:val="0"/>
               </w:rPr>
+              <w:t>0.2943</w:t>
             </w:r>
           </w:p>
         </w:tc>
@@ -6414,66 +6471,69 @@
               <w:rPr>
                 <w:rtl w:val="0"/>
               </w:rPr>
-            </w:r>
-          </w:p>
-        </w:tc>
-        <w:tc>
-          <w:tcPr>
-            <w:tcBorders>
-              <w:top w:color="cccccc" w:space="0" w:sz="4" w:val="single"/>
-              <w:left w:color="cccccc" w:space="0" w:sz="4" w:val="single"/>
-              <w:bottom w:color="cccccc" w:space="0" w:sz="4" w:val="single"/>
-              <w:right w:color="cccccc" w:space="0" w:sz="4" w:val="single"/>
-            </w:tcBorders>
-            <w:shd w:fill="f5f5f5" w:val="clear"/>
-            <w:tcMar>
-              <w:top w:w="60.0" w:type="dxa"/>
-              <w:left w:w="100.0" w:type="dxa"/>
-              <w:bottom w:w="60.0" w:type="dxa"/>
-              <w:right w:w="100.0" w:type="dxa"/>
-            </w:tcMar>
-            <w:vAlign w:val="center"/>
-          </w:tcPr>
-          <w:p>
-            <w:pPr>
-              <w:spacing w:after="0" w:before="0" w:lineRule="auto"/>
-              <w:jc w:val="center"/>
-              <w:rPr/>
-            </w:pPr>
-            <w:r>
-              <w:rPr>
-                <w:rtl w:val="0"/>
-              </w:rPr>
-            </w:r>
-          </w:p>
-        </w:tc>
-        <w:tc>
-          <w:tcPr>
-            <w:tcBorders>
-              <w:top w:color="cccccc" w:space="0" w:sz="4" w:val="single"/>
-              <w:left w:color="cccccc" w:space="0" w:sz="4" w:val="single"/>
-              <w:bottom w:color="cccccc" w:space="0" w:sz="4" w:val="single"/>
-              <w:right w:color="cccccc" w:space="0" w:sz="4" w:val="single"/>
-            </w:tcBorders>
-            <w:shd w:fill="f5f5f5" w:val="clear"/>
-            <w:tcMar>
-              <w:top w:w="60.0" w:type="dxa"/>
-              <w:left w:w="100.0" w:type="dxa"/>
-              <w:bottom w:w="60.0" w:type="dxa"/>
-              <w:right w:w="100.0" w:type="dxa"/>
-            </w:tcMar>
-            <w:vAlign w:val="center"/>
-          </w:tcPr>
-          <w:p>
-            <w:pPr>
-              <w:spacing w:after="0" w:before="0" w:lineRule="auto"/>
-              <w:jc w:val="center"/>
-              <w:rPr/>
-            </w:pPr>
-            <w:r>
-              <w:rPr>
-                <w:rtl w:val="0"/>
-              </w:rPr>
+              <w:t>780,073,875</w:t>
+            </w:r>
+          </w:p>
+        </w:tc>
+        <w:tc>
+          <w:tcPr>
+            <w:tcBorders>
+              <w:top w:color="cccccc" w:space="0" w:sz="4" w:val="single"/>
+              <w:left w:color="cccccc" w:space="0" w:sz="4" w:val="single"/>
+              <w:bottom w:color="cccccc" w:space="0" w:sz="4" w:val="single"/>
+              <w:right w:color="cccccc" w:space="0" w:sz="4" w:val="single"/>
+            </w:tcBorders>
+            <w:shd w:fill="f5f5f5" w:val="clear"/>
+            <w:tcMar>
+              <w:top w:w="60.0" w:type="dxa"/>
+              <w:left w:w="100.0" w:type="dxa"/>
+              <w:bottom w:w="60.0" w:type="dxa"/>
+              <w:right w:w="100.0" w:type="dxa"/>
+            </w:tcMar>
+            <w:vAlign w:val="center"/>
+          </w:tcPr>
+          <w:p>
+            <w:pPr>
+              <w:spacing w:after="0" w:before="0" w:lineRule="auto"/>
+              <w:jc w:val="center"/>
+              <w:rPr/>
+            </w:pPr>
+            <w:r>
+              <w:rPr>
+                <w:rtl w:val="0"/>
+              </w:rPr>
+              <w:t>1,249,975,000</w:t>
+            </w:r>
+          </w:p>
+        </w:tc>
+        <w:tc>
+          <w:tcPr>
+            <w:tcBorders>
+              <w:top w:color="cccccc" w:space="0" w:sz="4" w:val="single"/>
+              <w:left w:color="cccccc" w:space="0" w:sz="4" w:val="single"/>
+              <w:bottom w:color="cccccc" w:space="0" w:sz="4" w:val="single"/>
+              <w:right w:color="cccccc" w:space="0" w:sz="4" w:val="single"/>
+            </w:tcBorders>
+            <w:shd w:fill="f5f5f5" w:val="clear"/>
+            <w:tcMar>
+              <w:top w:w="60.0" w:type="dxa"/>
+              <w:left w:w="100.0" w:type="dxa"/>
+              <w:bottom w:w="60.0" w:type="dxa"/>
+              <w:right w:w="100.0" w:type="dxa"/>
+            </w:tcMar>
+            <w:vAlign w:val="center"/>
+          </w:tcPr>
+          <w:p>
+            <w:pPr>
+              <w:spacing w:after="0" w:before="0" w:lineRule="auto"/>
+              <w:jc w:val="center"/>
+              <w:rPr/>
+            </w:pPr>
+            <w:r>
+              <w:rPr>
+                <w:rtl w:val="0"/>
+              </w:rPr>
+              <w:t>0.3120</w:t>
             </w:r>
           </w:p>
         </w:tc>
@@ -7051,66 +7111,69 @@
               <w:rPr>
                 <w:rtl w:val="0"/>
               </w:rPr>
-            </w:r>
-          </w:p>
-        </w:tc>
-        <w:tc>
-          <w:tcPr>
-            <w:tcBorders>
-              <w:top w:color="cccccc" w:space="0" w:sz="4" w:val="single"/>
-              <w:left w:color="cccccc" w:space="0" w:sz="4" w:val="single"/>
-              <w:bottom w:color="cccccc" w:space="0" w:sz="4" w:val="single"/>
-              <w:right w:color="cccccc" w:space="0" w:sz="4" w:val="single"/>
-            </w:tcBorders>
-            <w:shd w:fill="f5f5f5" w:val="clear"/>
-            <w:tcMar>
-              <w:top w:w="60.0" w:type="dxa"/>
-              <w:left w:w="100.0" w:type="dxa"/>
-              <w:bottom w:w="60.0" w:type="dxa"/>
-              <w:right w:w="100.0" w:type="dxa"/>
-            </w:tcMar>
-            <w:vAlign w:val="center"/>
-          </w:tcPr>
-          <w:p>
-            <w:pPr>
-              <w:spacing w:after="0" w:before="0" w:lineRule="auto"/>
-              <w:jc w:val="center"/>
-              <w:rPr/>
-            </w:pPr>
-            <w:r>
-              <w:rPr>
-                <w:rtl w:val="0"/>
-              </w:rPr>
-            </w:r>
-          </w:p>
-        </w:tc>
-        <w:tc>
-          <w:tcPr>
-            <w:tcBorders>
-              <w:top w:color="cccccc" w:space="0" w:sz="4" w:val="single"/>
-              <w:left w:color="cccccc" w:space="0" w:sz="4" w:val="single"/>
-              <w:bottom w:color="cccccc" w:space="0" w:sz="4" w:val="single"/>
-              <w:right w:color="cccccc" w:space="0" w:sz="4" w:val="single"/>
-            </w:tcBorders>
-            <w:shd w:fill="f5f5f5" w:val="clear"/>
-            <w:tcMar>
-              <w:top w:w="60.0" w:type="dxa"/>
-              <w:left w:w="100.0" w:type="dxa"/>
-              <w:bottom w:w="60.0" w:type="dxa"/>
-              <w:right w:w="100.0" w:type="dxa"/>
-            </w:tcMar>
-            <w:vAlign w:val="center"/>
-          </w:tcPr>
-          <w:p>
-            <w:pPr>
-              <w:spacing w:after="0" w:before="0" w:lineRule="auto"/>
-              <w:jc w:val="center"/>
-              <w:rPr/>
-            </w:pPr>
-            <w:r>
-              <w:rPr>
-                <w:rtl w:val="0"/>
-              </w:rPr>
+              <w:t>1,424,250</w:t>
+            </w:r>
+          </w:p>
+        </w:tc>
+        <w:tc>
+          <w:tcPr>
+            <w:tcBorders>
+              <w:top w:color="cccccc" w:space="0" w:sz="4" w:val="single"/>
+              <w:left w:color="cccccc" w:space="0" w:sz="4" w:val="single"/>
+              <w:bottom w:color="cccccc" w:space="0" w:sz="4" w:val="single"/>
+              <w:right w:color="cccccc" w:space="0" w:sz="4" w:val="single"/>
+            </w:tcBorders>
+            <w:shd w:fill="f5f5f5" w:val="clear"/>
+            <w:tcMar>
+              <w:top w:w="60.0" w:type="dxa"/>
+              <w:left w:w="100.0" w:type="dxa"/>
+              <w:bottom w:w="60.0" w:type="dxa"/>
+              <w:right w:w="100.0" w:type="dxa"/>
+            </w:tcMar>
+            <w:vAlign w:val="center"/>
+          </w:tcPr>
+          <w:p>
+            <w:pPr>
+              <w:spacing w:after="0" w:before="0" w:lineRule="auto"/>
+              <w:jc w:val="center"/>
+              <w:rPr/>
+            </w:pPr>
+            <w:r>
+              <w:rPr>
+                <w:rtl w:val="0"/>
+              </w:rPr>
+              <w:t>499,500</w:t>
+            </w:r>
+          </w:p>
+        </w:tc>
+        <w:tc>
+          <w:tcPr>
+            <w:tcBorders>
+              <w:top w:color="cccccc" w:space="0" w:sz="4" w:val="single"/>
+              <w:left w:color="cccccc" w:space="0" w:sz="4" w:val="single"/>
+              <w:bottom w:color="cccccc" w:space="0" w:sz="4" w:val="single"/>
+              <w:right w:color="cccccc" w:space="0" w:sz="4" w:val="single"/>
+            </w:tcBorders>
+            <w:shd w:fill="f5f5f5" w:val="clear"/>
+            <w:tcMar>
+              <w:top w:w="60.0" w:type="dxa"/>
+              <w:left w:w="100.0" w:type="dxa"/>
+              <w:bottom w:w="60.0" w:type="dxa"/>
+              <w:right w:w="100.0" w:type="dxa"/>
+            </w:tcMar>
+            <w:vAlign w:val="center"/>
+          </w:tcPr>
+          <w:p>
+            <w:pPr>
+              <w:spacing w:after="0" w:before="0" w:lineRule="auto"/>
+              <w:jc w:val="center"/>
+              <w:rPr/>
+            </w:pPr>
+            <w:r>
+              <w:rPr>
+                <w:rtl w:val="0"/>
+              </w:rPr>
+              <w:t>1.4243</w:t>
             </w:r>
           </w:p>
         </w:tc>
@@ -7257,6 +7320,7 @@
               <w:rPr>
                 <w:rtl w:val="0"/>
               </w:rPr>
+              <w:t>29,610,583</w:t>
             </w:r>
           </w:p>
         </w:tc>
@@ -7287,6 +7351,7 @@
               <w:rPr>
                 <w:rtl w:val="0"/>
               </w:rPr>
+              <w:t>12,497,500</w:t>
             </w:r>
           </w:p>
         </w:tc>
@@ -7317,6 +7382,7 @@
               <w:rPr>
                 <w:rtl w:val="0"/>
               </w:rPr>
+              <w:t>1.1844</w:t>
             </w:r>
           </w:p>
         </w:tc>
@@ -7463,66 +7529,69 @@
               <w:rPr>
                 <w:rtl w:val="0"/>
               </w:rPr>
-            </w:r>
-          </w:p>
-        </w:tc>
-        <w:tc>
-          <w:tcPr>
-            <w:tcBorders>
-              <w:top w:color="cccccc" w:space="0" w:sz="4" w:val="single"/>
-              <w:left w:color="cccccc" w:space="0" w:sz="4" w:val="single"/>
-              <w:bottom w:color="cccccc" w:space="0" w:sz="4" w:val="single"/>
-              <w:right w:color="cccccc" w:space="0" w:sz="4" w:val="single"/>
-            </w:tcBorders>
-            <w:shd w:fill="f5f5f5" w:val="clear"/>
-            <w:tcMar>
-              <w:top w:w="60.0" w:type="dxa"/>
-              <w:left w:w="100.0" w:type="dxa"/>
-              <w:bottom w:w="60.0" w:type="dxa"/>
-              <w:right w:w="100.0" w:type="dxa"/>
-            </w:tcMar>
-            <w:vAlign w:val="center"/>
-          </w:tcPr>
-          <w:p>
-            <w:pPr>
-              <w:spacing w:after="0" w:before="0" w:lineRule="auto"/>
-              <w:jc w:val="center"/>
-              <w:rPr/>
-            </w:pPr>
-            <w:r>
-              <w:rPr>
-                <w:rtl w:val="0"/>
-              </w:rPr>
-            </w:r>
-          </w:p>
-        </w:tc>
-        <w:tc>
-          <w:tcPr>
-            <w:tcBorders>
-              <w:top w:color="cccccc" w:space="0" w:sz="4" w:val="single"/>
-              <w:left w:color="cccccc" w:space="0" w:sz="4" w:val="single"/>
-              <w:bottom w:color="cccccc" w:space="0" w:sz="4" w:val="single"/>
-              <w:right w:color="cccccc" w:space="0" w:sz="4" w:val="single"/>
-            </w:tcBorders>
-            <w:shd w:fill="f5f5f5" w:val="clear"/>
-            <w:tcMar>
-              <w:top w:w="60.0" w:type="dxa"/>
-              <w:left w:w="100.0" w:type="dxa"/>
-              <w:bottom w:w="60.0" w:type="dxa"/>
-              <w:right w:w="100.0" w:type="dxa"/>
-            </w:tcMar>
-            <w:vAlign w:val="center"/>
-          </w:tcPr>
-          <w:p>
-            <w:pPr>
-              <w:spacing w:after="0" w:before="0" w:lineRule="auto"/>
-              <w:jc w:val="center"/>
-              <w:rPr/>
-            </w:pPr>
-            <w:r>
-              <w:rPr>
-                <w:rtl w:val="0"/>
-              </w:rPr>
+              <w:t>101,189,625</w:t>
+            </w:r>
+          </w:p>
+        </w:tc>
+        <w:tc>
+          <w:tcPr>
+            <w:tcBorders>
+              <w:top w:color="cccccc" w:space="0" w:sz="4" w:val="single"/>
+              <w:left w:color="cccccc" w:space="0" w:sz="4" w:val="single"/>
+              <w:bottom w:color="cccccc" w:space="0" w:sz="4" w:val="single"/>
+              <w:right w:color="cccccc" w:space="0" w:sz="4" w:val="single"/>
+            </w:tcBorders>
+            <w:shd w:fill="f5f5f5" w:val="clear"/>
+            <w:tcMar>
+              <w:top w:w="60.0" w:type="dxa"/>
+              <w:left w:w="100.0" w:type="dxa"/>
+              <w:bottom w:w="60.0" w:type="dxa"/>
+              <w:right w:w="100.0" w:type="dxa"/>
+            </w:tcMar>
+            <w:vAlign w:val="center"/>
+          </w:tcPr>
+          <w:p>
+            <w:pPr>
+              <w:spacing w:after="0" w:before="0" w:lineRule="auto"/>
+              <w:jc w:val="center"/>
+              <w:rPr/>
+            </w:pPr>
+            <w:r>
+              <w:rPr>
+                <w:rtl w:val="0"/>
+              </w:rPr>
+              <w:t>49,995,000</w:t>
+            </w:r>
+          </w:p>
+        </w:tc>
+        <w:tc>
+          <w:tcPr>
+            <w:tcBorders>
+              <w:top w:color="cccccc" w:space="0" w:sz="4" w:val="single"/>
+              <w:left w:color="cccccc" w:space="0" w:sz="4" w:val="single"/>
+              <w:bottom w:color="cccccc" w:space="0" w:sz="4" w:val="single"/>
+              <w:right w:color="cccccc" w:space="0" w:sz="4" w:val="single"/>
+            </w:tcBorders>
+            <w:shd w:fill="f5f5f5" w:val="clear"/>
+            <w:tcMar>
+              <w:top w:w="60.0" w:type="dxa"/>
+              <w:left w:w="100.0" w:type="dxa"/>
+              <w:bottom w:w="60.0" w:type="dxa"/>
+              <w:right w:w="100.0" w:type="dxa"/>
+            </w:tcMar>
+            <w:vAlign w:val="center"/>
+          </w:tcPr>
+          <w:p>
+            <w:pPr>
+              <w:spacing w:after="0" w:before="0" w:lineRule="auto"/>
+              <w:jc w:val="center"/>
+              <w:rPr/>
+            </w:pPr>
+            <w:r>
+              <w:rPr>
+                <w:rtl w:val="0"/>
+              </w:rPr>
+              <w:t>1.0119</w:t>
             </w:r>
           </w:p>
         </w:tc>
@@ -7669,6 +7738,7 @@
               <w:rPr>
                 <w:rtl w:val="0"/>
               </w:rPr>
+              <w:t>483,030,750</w:t>
             </w:r>
           </w:p>
         </w:tc>
@@ -7699,6 +7769,7 @@
               <w:rPr>
                 <w:rtl w:val="0"/>
               </w:rPr>
+              <w:t>312,487,500</w:t>
             </w:r>
           </w:p>
         </w:tc>
@@ -7729,6 +7800,7 @@
               <w:rPr>
                 <w:rtl w:val="0"/>
               </w:rPr>
+              <w:t>0.7728</w:t>
             </w:r>
           </w:p>
         </w:tc>
@@ -7875,66 +7947,69 @@
               <w:rPr>
                 <w:rtl w:val="0"/>
               </w:rPr>
-            </w:r>
-          </w:p>
-        </w:tc>
-        <w:tc>
-          <w:tcPr>
-            <w:tcBorders>
-              <w:top w:color="cccccc" w:space="0" w:sz="4" w:val="single"/>
-              <w:left w:color="cccccc" w:space="0" w:sz="4" w:val="single"/>
-              <w:bottom w:color="cccccc" w:space="0" w:sz="4" w:val="single"/>
-              <w:right w:color="cccccc" w:space="0" w:sz="4" w:val="single"/>
-            </w:tcBorders>
-            <w:shd w:fill="f5f5f5" w:val="clear"/>
-            <w:tcMar>
-              <w:top w:w="60.0" w:type="dxa"/>
-              <w:left w:w="100.0" w:type="dxa"/>
-              <w:bottom w:w="60.0" w:type="dxa"/>
-              <w:right w:w="100.0" w:type="dxa"/>
-            </w:tcMar>
-            <w:vAlign w:val="center"/>
-          </w:tcPr>
-          <w:p>
-            <w:pPr>
-              <w:spacing w:after="0" w:before="0" w:lineRule="auto"/>
-              <w:jc w:val="center"/>
-              <w:rPr/>
-            </w:pPr>
-            <w:r>
-              <w:rPr>
-                <w:rtl w:val="0"/>
-              </w:rPr>
-            </w:r>
-          </w:p>
-        </w:tc>
-        <w:tc>
-          <w:tcPr>
-            <w:tcBorders>
-              <w:top w:color="cccccc" w:space="0" w:sz="4" w:val="single"/>
-              <w:left w:color="cccccc" w:space="0" w:sz="4" w:val="single"/>
-              <w:bottom w:color="cccccc" w:space="0" w:sz="4" w:val="single"/>
-              <w:right w:color="cccccc" w:space="0" w:sz="4" w:val="single"/>
-            </w:tcBorders>
-            <w:shd w:fill="f5f5f5" w:val="clear"/>
-            <w:tcMar>
-              <w:top w:w="60.0" w:type="dxa"/>
-              <w:left w:w="100.0" w:type="dxa"/>
-              <w:bottom w:w="60.0" w:type="dxa"/>
-              <w:right w:w="100.0" w:type="dxa"/>
-            </w:tcMar>
-            <w:vAlign w:val="center"/>
-          </w:tcPr>
-          <w:p>
-            <w:pPr>
-              <w:spacing w:after="0" w:before="0" w:lineRule="auto"/>
-              <w:jc w:val="center"/>
-              <w:rPr/>
-            </w:pPr>
-            <w:r>
-              <w:rPr>
-                <w:rtl w:val="0"/>
-              </w:rPr>
+              <w:t>1,457,087,458</w:t>
+            </w:r>
+          </w:p>
+        </w:tc>
+        <w:tc>
+          <w:tcPr>
+            <w:tcBorders>
+              <w:top w:color="cccccc" w:space="0" w:sz="4" w:val="single"/>
+              <w:left w:color="cccccc" w:space="0" w:sz="4" w:val="single"/>
+              <w:bottom w:color="cccccc" w:space="0" w:sz="4" w:val="single"/>
+              <w:right w:color="cccccc" w:space="0" w:sz="4" w:val="single"/>
+            </w:tcBorders>
+            <w:shd w:fill="f5f5f5" w:val="clear"/>
+            <w:tcMar>
+              <w:top w:w="60.0" w:type="dxa"/>
+              <w:left w:w="100.0" w:type="dxa"/>
+              <w:bottom w:w="60.0" w:type="dxa"/>
+              <w:right w:w="100.0" w:type="dxa"/>
+            </w:tcMar>
+            <w:vAlign w:val="center"/>
+          </w:tcPr>
+          <w:p>
+            <w:pPr>
+              <w:spacing w:after="0" w:before="0" w:lineRule="auto"/>
+              <w:jc w:val="center"/>
+              <w:rPr/>
+            </w:pPr>
+            <w:r>
+              <w:rPr>
+                <w:rtl w:val="0"/>
+              </w:rPr>
+              <w:t>1,249,975,000</w:t>
+            </w:r>
+          </w:p>
+        </w:tc>
+        <w:tc>
+          <w:tcPr>
+            <w:tcBorders>
+              <w:top w:color="cccccc" w:space="0" w:sz="4" w:val="single"/>
+              <w:left w:color="cccccc" w:space="0" w:sz="4" w:val="single"/>
+              <w:bottom w:color="cccccc" w:space="0" w:sz="4" w:val="single"/>
+              <w:right w:color="cccccc" w:space="0" w:sz="4" w:val="single"/>
+            </w:tcBorders>
+            <w:shd w:fill="f5f5f5" w:val="clear"/>
+            <w:tcMar>
+              <w:top w:w="60.0" w:type="dxa"/>
+              <w:left w:w="100.0" w:type="dxa"/>
+              <w:bottom w:w="60.0" w:type="dxa"/>
+              <w:right w:w="100.0" w:type="dxa"/>
+            </w:tcMar>
+            <w:vAlign w:val="center"/>
+          </w:tcPr>
+          <w:p>
+            <w:pPr>
+              <w:spacing w:after="0" w:before="0" w:lineRule="auto"/>
+              <w:jc w:val="center"/>
+              <w:rPr/>
+            </w:pPr>
+            <w:r>
+              <w:rPr>
+                <w:rtl w:val="0"/>
+              </w:rPr>
+              <w:t>0.5828</w:t>
             </w:r>
           </w:p>
         </w:tc>
@@ -8512,66 +8587,69 @@
               <w:rPr>
                 <w:rtl w:val="0"/>
               </w:rPr>
-            </w:r>
-          </w:p>
-        </w:tc>
-        <w:tc>
-          <w:tcPr>
-            <w:tcBorders>
-              <w:top w:color="cccccc" w:space="0" w:sz="4" w:val="single"/>
-              <w:left w:color="cccccc" w:space="0" w:sz="4" w:val="single"/>
-              <w:bottom w:color="cccccc" w:space="0" w:sz="4" w:val="single"/>
-              <w:right w:color="cccccc" w:space="0" w:sz="4" w:val="single"/>
-            </w:tcBorders>
-            <w:shd w:fill="f5f5f5" w:val="clear"/>
-            <w:tcMar>
-              <w:top w:w="60.0" w:type="dxa"/>
-              <w:left w:w="100.0" w:type="dxa"/>
-              <w:bottom w:w="60.0" w:type="dxa"/>
-              <w:right w:w="100.0" w:type="dxa"/>
-            </w:tcMar>
-            <w:vAlign w:val="center"/>
-          </w:tcPr>
-          <w:p>
-            <w:pPr>
-              <w:spacing w:after="0" w:before="0" w:lineRule="auto"/>
-              <w:jc w:val="center"/>
-              <w:rPr/>
-            </w:pPr>
-            <w:r>
-              <w:rPr>
-                <w:rtl w:val="0"/>
-              </w:rPr>
-            </w:r>
-          </w:p>
-        </w:tc>
-        <w:tc>
-          <w:tcPr>
-            <w:tcBorders>
-              <w:top w:color="cccccc" w:space="0" w:sz="4" w:val="single"/>
-              <w:left w:color="cccccc" w:space="0" w:sz="4" w:val="single"/>
-              <w:bottom w:color="cccccc" w:space="0" w:sz="4" w:val="single"/>
-              <w:right w:color="cccccc" w:space="0" w:sz="4" w:val="single"/>
-            </w:tcBorders>
-            <w:shd w:fill="f5f5f5" w:val="clear"/>
-            <w:tcMar>
-              <w:top w:w="60.0" w:type="dxa"/>
-              <w:left w:w="100.0" w:type="dxa"/>
-              <w:bottom w:w="60.0" w:type="dxa"/>
-              <w:right w:w="100.0" w:type="dxa"/>
-            </w:tcMar>
-            <w:vAlign w:val="center"/>
-          </w:tcPr>
-          <w:p>
-            <w:pPr>
-              <w:spacing w:after="0" w:before="0" w:lineRule="auto"/>
-              <w:jc w:val="center"/>
-              <w:rPr/>
-            </w:pPr>
-            <w:r>
-              <w:rPr>
-                <w:rtl w:val="0"/>
-              </w:rPr>
+              <w:t>1,207,042</w:t>
+            </w:r>
+          </w:p>
+        </w:tc>
+        <w:tc>
+          <w:tcPr>
+            <w:tcBorders>
+              <w:top w:color="cccccc" w:space="0" w:sz="4" w:val="single"/>
+              <w:left w:color="cccccc" w:space="0" w:sz="4" w:val="single"/>
+              <w:bottom w:color="cccccc" w:space="0" w:sz="4" w:val="single"/>
+              <w:right w:color="cccccc" w:space="0" w:sz="4" w:val="single"/>
+            </w:tcBorders>
+            <w:shd w:fill="f5f5f5" w:val="clear"/>
+            <w:tcMar>
+              <w:top w:w="60.0" w:type="dxa"/>
+              <w:left w:w="100.0" w:type="dxa"/>
+              <w:bottom w:w="60.0" w:type="dxa"/>
+              <w:right w:w="100.0" w:type="dxa"/>
+            </w:tcMar>
+            <w:vAlign w:val="center"/>
+          </w:tcPr>
+          <w:p>
+            <w:pPr>
+              <w:spacing w:after="0" w:before="0" w:lineRule="auto"/>
+              <w:jc w:val="center"/>
+              <w:rPr/>
+            </w:pPr>
+            <w:r>
+              <w:rPr>
+                <w:rtl w:val="0"/>
+              </w:rPr>
+              <w:t>499,500</w:t>
+            </w:r>
+          </w:p>
+        </w:tc>
+        <w:tc>
+          <w:tcPr>
+            <w:tcBorders>
+              <w:top w:color="cccccc" w:space="0" w:sz="4" w:val="single"/>
+              <w:left w:color="cccccc" w:space="0" w:sz="4" w:val="single"/>
+              <w:bottom w:color="cccccc" w:space="0" w:sz="4" w:val="single"/>
+              <w:right w:color="cccccc" w:space="0" w:sz="4" w:val="single"/>
+            </w:tcBorders>
+            <w:shd w:fill="f5f5f5" w:val="clear"/>
+            <w:tcMar>
+              <w:top w:w="60.0" w:type="dxa"/>
+              <w:left w:w="100.0" w:type="dxa"/>
+              <w:bottom w:w="60.0" w:type="dxa"/>
+              <w:right w:w="100.0" w:type="dxa"/>
+            </w:tcMar>
+            <w:vAlign w:val="center"/>
+          </w:tcPr>
+          <w:p>
+            <w:pPr>
+              <w:spacing w:after="0" w:before="0" w:lineRule="auto"/>
+              <w:jc w:val="center"/>
+              <w:rPr/>
+            </w:pPr>
+            <w:r>
+              <w:rPr>
+                <w:rtl w:val="0"/>
+              </w:rPr>
+              <w:t>1.2070</w:t>
             </w:r>
           </w:p>
         </w:tc>
@@ -8718,6 +8796,7 @@
               <w:rPr>
                 <w:rtl w:val="0"/>
               </w:rPr>
+              <w:t>20,518,708</w:t>
             </w:r>
           </w:p>
         </w:tc>
@@ -8748,6 +8827,7 @@
               <w:rPr>
                 <w:rtl w:val="0"/>
               </w:rPr>
+              <w:t>12,497,500</w:t>
             </w:r>
           </w:p>
         </w:tc>
@@ -8778,6 +8858,7 @@
               <w:rPr>
                 <w:rtl w:val="0"/>
               </w:rPr>
+              <w:t>0.8207</w:t>
             </w:r>
           </w:p>
         </w:tc>
@@ -8924,66 +9005,69 @@
               <w:rPr>
                 <w:rtl w:val="0"/>
               </w:rPr>
-            </w:r>
-          </w:p>
-        </w:tc>
-        <w:tc>
-          <w:tcPr>
-            <w:tcBorders>
-              <w:top w:color="cccccc" w:space="0" w:sz="4" w:val="single"/>
-              <w:left w:color="cccccc" w:space="0" w:sz="4" w:val="single"/>
-              <w:bottom w:color="cccccc" w:space="0" w:sz="4" w:val="single"/>
-              <w:right w:color="cccccc" w:space="0" w:sz="4" w:val="single"/>
-            </w:tcBorders>
-            <w:shd w:fill="f5f5f5" w:val="clear"/>
-            <w:tcMar>
-              <w:top w:w="60.0" w:type="dxa"/>
-              <w:left w:w="100.0" w:type="dxa"/>
-              <w:bottom w:w="60.0" w:type="dxa"/>
-              <w:right w:w="100.0" w:type="dxa"/>
-            </w:tcMar>
-            <w:vAlign w:val="center"/>
-          </w:tcPr>
-          <w:p>
-            <w:pPr>
-              <w:spacing w:after="0" w:before="0" w:lineRule="auto"/>
-              <w:jc w:val="center"/>
-              <w:rPr/>
-            </w:pPr>
-            <w:r>
-              <w:rPr>
-                <w:rtl w:val="0"/>
-              </w:rPr>
-            </w:r>
-          </w:p>
-        </w:tc>
-        <w:tc>
-          <w:tcPr>
-            <w:tcBorders>
-              <w:top w:color="cccccc" w:space="0" w:sz="4" w:val="single"/>
-              <w:left w:color="cccccc" w:space="0" w:sz="4" w:val="single"/>
-              <w:bottom w:color="cccccc" w:space="0" w:sz="4" w:val="single"/>
-              <w:right w:color="cccccc" w:space="0" w:sz="4" w:val="single"/>
-            </w:tcBorders>
-            <w:shd w:fill="f5f5f5" w:val="clear"/>
-            <w:tcMar>
-              <w:top w:w="60.0" w:type="dxa"/>
-              <w:left w:w="100.0" w:type="dxa"/>
-              <w:bottom w:w="60.0" w:type="dxa"/>
-              <w:right w:w="100.0" w:type="dxa"/>
-            </w:tcMar>
-            <w:vAlign w:val="center"/>
-          </w:tcPr>
-          <w:p>
-            <w:pPr>
-              <w:spacing w:after="0" w:before="0" w:lineRule="auto"/>
-              <w:jc w:val="center"/>
-              <w:rPr/>
-            </w:pPr>
-            <w:r>
-              <w:rPr>
-                <w:rtl w:val="0"/>
-              </w:rPr>
+              <w:t>65,358,584</w:t>
+            </w:r>
+          </w:p>
+        </w:tc>
+        <w:tc>
+          <w:tcPr>
+            <w:tcBorders>
+              <w:top w:color="cccccc" w:space="0" w:sz="4" w:val="single"/>
+              <w:left w:color="cccccc" w:space="0" w:sz="4" w:val="single"/>
+              <w:bottom w:color="cccccc" w:space="0" w:sz="4" w:val="single"/>
+              <w:right w:color="cccccc" w:space="0" w:sz="4" w:val="single"/>
+            </w:tcBorders>
+            <w:shd w:fill="f5f5f5" w:val="clear"/>
+            <w:tcMar>
+              <w:top w:w="60.0" w:type="dxa"/>
+              <w:left w:w="100.0" w:type="dxa"/>
+              <w:bottom w:w="60.0" w:type="dxa"/>
+              <w:right w:w="100.0" w:type="dxa"/>
+            </w:tcMar>
+            <w:vAlign w:val="center"/>
+          </w:tcPr>
+          <w:p>
+            <w:pPr>
+              <w:spacing w:after="0" w:before="0" w:lineRule="auto"/>
+              <w:jc w:val="center"/>
+              <w:rPr/>
+            </w:pPr>
+            <w:r>
+              <w:rPr>
+                <w:rtl w:val="0"/>
+              </w:rPr>
+              <w:t>49,995,000</w:t>
+            </w:r>
+          </w:p>
+        </w:tc>
+        <w:tc>
+          <w:tcPr>
+            <w:tcBorders>
+              <w:top w:color="cccccc" w:space="0" w:sz="4" w:val="single"/>
+              <w:left w:color="cccccc" w:space="0" w:sz="4" w:val="single"/>
+              <w:bottom w:color="cccccc" w:space="0" w:sz="4" w:val="single"/>
+              <w:right w:color="cccccc" w:space="0" w:sz="4" w:val="single"/>
+            </w:tcBorders>
+            <w:shd w:fill="f5f5f5" w:val="clear"/>
+            <w:tcMar>
+              <w:top w:w="60.0" w:type="dxa"/>
+              <w:left w:w="100.0" w:type="dxa"/>
+              <w:bottom w:w="60.0" w:type="dxa"/>
+              <w:right w:w="100.0" w:type="dxa"/>
+            </w:tcMar>
+            <w:vAlign w:val="center"/>
+          </w:tcPr>
+          <w:p>
+            <w:pPr>
+              <w:spacing w:after="0" w:before="0" w:lineRule="auto"/>
+              <w:jc w:val="center"/>
+              <w:rPr/>
+            </w:pPr>
+            <w:r>
+              <w:rPr>
+                <w:rtl w:val="0"/>
+              </w:rPr>
+              <w:t>0.6536</w:t>
             </w:r>
           </w:p>
         </w:tc>
@@ -9130,6 +9214,7 @@
               <w:rPr>
                 <w:rtl w:val="0"/>
               </w:rPr>
+              <w:t>315,982,250</w:t>
             </w:r>
           </w:p>
         </w:tc>
@@ -9160,6 +9245,7 @@
               <w:rPr>
                 <w:rtl w:val="0"/>
               </w:rPr>
+              <w:t>312,487,500</w:t>
             </w:r>
           </w:p>
         </w:tc>
@@ -9190,6 +9276,7 @@
               <w:rPr>
                 <w:rtl w:val="0"/>
               </w:rPr>
+              <w:t>0.5056</w:t>
             </w:r>
           </w:p>
         </w:tc>
@@ -9336,66 +9423,69 @@
               <w:rPr>
                 <w:rtl w:val="0"/>
               </w:rPr>
-            </w:r>
-          </w:p>
-        </w:tc>
-        <w:tc>
-          <w:tcPr>
-            <w:tcBorders>
-              <w:top w:color="cccccc" w:space="0" w:sz="4" w:val="single"/>
-              <w:left w:color="cccccc" w:space="0" w:sz="4" w:val="single"/>
-              <w:bottom w:color="cccccc" w:space="0" w:sz="4" w:val="single"/>
-              <w:right w:color="cccccc" w:space="0" w:sz="4" w:val="single"/>
-            </w:tcBorders>
-            <w:shd w:fill="f5f5f5" w:val="clear"/>
-            <w:tcMar>
-              <w:top w:w="60.0" w:type="dxa"/>
-              <w:left w:w="100.0" w:type="dxa"/>
-              <w:bottom w:w="60.0" w:type="dxa"/>
-              <w:right w:w="100.0" w:type="dxa"/>
-            </w:tcMar>
-            <w:vAlign w:val="center"/>
-          </w:tcPr>
-          <w:p>
-            <w:pPr>
-              <w:spacing w:after="0" w:before="0" w:lineRule="auto"/>
-              <w:jc w:val="center"/>
-              <w:rPr/>
-            </w:pPr>
-            <w:r>
-              <w:rPr>
-                <w:rtl w:val="0"/>
-              </w:rPr>
-            </w:r>
-          </w:p>
-        </w:tc>
-        <w:tc>
-          <w:tcPr>
-            <w:tcBorders>
-              <w:top w:color="cccccc" w:space="0" w:sz="4" w:val="single"/>
-              <w:left w:color="cccccc" w:space="0" w:sz="4" w:val="single"/>
-              <w:bottom w:color="cccccc" w:space="0" w:sz="4" w:val="single"/>
-              <w:right w:color="cccccc" w:space="0" w:sz="4" w:val="single"/>
-            </w:tcBorders>
-            <w:shd w:fill="f5f5f5" w:val="clear"/>
-            <w:tcMar>
-              <w:top w:w="60.0" w:type="dxa"/>
-              <w:left w:w="100.0" w:type="dxa"/>
-              <w:bottom w:w="60.0" w:type="dxa"/>
-              <w:right w:w="100.0" w:type="dxa"/>
-            </w:tcMar>
-            <w:vAlign w:val="center"/>
-          </w:tcPr>
-          <w:p>
-            <w:pPr>
-              <w:spacing w:after="0" w:before="0" w:lineRule="auto"/>
-              <w:jc w:val="center"/>
-              <w:rPr/>
-            </w:pPr>
-            <w:r>
-              <w:rPr>
-                <w:rtl w:val="0"/>
-              </w:rPr>
+              <w:t>1,420,650,875</w:t>
+            </w:r>
+          </w:p>
+        </w:tc>
+        <w:tc>
+          <w:tcPr>
+            <w:tcBorders>
+              <w:top w:color="cccccc" w:space="0" w:sz="4" w:val="single"/>
+              <w:left w:color="cccccc" w:space="0" w:sz="4" w:val="single"/>
+              <w:bottom w:color="cccccc" w:space="0" w:sz="4" w:val="single"/>
+              <w:right w:color="cccccc" w:space="0" w:sz="4" w:val="single"/>
+            </w:tcBorders>
+            <w:shd w:fill="f5f5f5" w:val="clear"/>
+            <w:tcMar>
+              <w:top w:w="60.0" w:type="dxa"/>
+              <w:left w:w="100.0" w:type="dxa"/>
+              <w:bottom w:w="60.0" w:type="dxa"/>
+              <w:right w:w="100.0" w:type="dxa"/>
+            </w:tcMar>
+            <w:vAlign w:val="center"/>
+          </w:tcPr>
+          <w:p>
+            <w:pPr>
+              <w:spacing w:after="0" w:before="0" w:lineRule="auto"/>
+              <w:jc w:val="center"/>
+              <w:rPr/>
+            </w:pPr>
+            <w:r>
+              <w:rPr>
+                <w:rtl w:val="0"/>
+              </w:rPr>
+              <w:t>1,249,975,000</w:t>
+            </w:r>
+          </w:p>
+        </w:tc>
+        <w:tc>
+          <w:tcPr>
+            <w:tcBorders>
+              <w:top w:color="cccccc" w:space="0" w:sz="4" w:val="single"/>
+              <w:left w:color="cccccc" w:space="0" w:sz="4" w:val="single"/>
+              <w:bottom w:color="cccccc" w:space="0" w:sz="4" w:val="single"/>
+              <w:right w:color="cccccc" w:space="0" w:sz="4" w:val="single"/>
+            </w:tcBorders>
+            <w:shd w:fill="f5f5f5" w:val="clear"/>
+            <w:tcMar>
+              <w:top w:w="60.0" w:type="dxa"/>
+              <w:left w:w="100.0" w:type="dxa"/>
+              <w:bottom w:w="60.0" w:type="dxa"/>
+              <w:right w:w="100.0" w:type="dxa"/>
+            </w:tcMar>
+            <w:vAlign w:val="center"/>
+          </w:tcPr>
+          <w:p>
+            <w:pPr>
+              <w:spacing w:after="0" w:before="0" w:lineRule="auto"/>
+              <w:jc w:val="center"/>
+              <w:rPr/>
+            </w:pPr>
+            <w:r>
+              <w:rPr>
+                <w:rtl w:val="0"/>
+              </w:rPr>
+              <w:t>0.5683</w:t>
             </w:r>
           </w:p>
         </w:tc>

</xml_diff>

<commit_message>
add Section 1 label to theoretical analysis
</commit_message>
<xml_diff>
--- a/theoretical_vs_experimental_data.docx
+++ b/theoretical_vs_experimental_data.docx
@@ -200,6 +200,14 @@
         <w:rPr>
           <w:rtl w:val="0"/>
         </w:rPr>
+      </w:r>
+    </w:p>
+    <w:p>
+      <w:pPr>
+        <w:pStyle w:val="Heading1"/>
+      </w:pPr>
+      <w:r>
+        <w:t>Section 1: Theoretical Analysis</w:t>
       </w:r>
     </w:p>
     <w:p>

</xml_diff>